<commit_message>
Update 2.4_GuiaEstudiante_Fase 2_DesarrolloProyecto APT.docx
</commit_message>
<xml_diff>
--- a/Fase 2/Evidencias Grupales/2.4_GuiaEstudiante_Fase 2_DesarrolloProyecto APT.docx
+++ b/Fase 2/Evidencias Grupales/2.4_GuiaEstudiante_Fase 2_DesarrolloProyecto APT.docx
@@ -256,7 +256,7 @@
                         <pic:cNvPicPr preferRelativeResize="0"/>
                       </pic:nvPicPr>
                       <pic:blipFill>
-                        <a:blip r:embed="rId7"/>
+                        <a:blip r:embed="rId8"/>
                         <a:srcRect/>
                         <a:stretch>
                           <a:fillRect/>
@@ -520,9 +520,8 @@
     <w:tbl>
       <w:tblPr>
         <w:tblStyle w:val="Table2"/>
-        <w:tblW w:w="7636.25552724583" w:type="dxa"/>
+        <w:tblW w:w="7635.0" w:type="dxa"/>
         <w:jc w:val="left"/>
-        <w:tblInd w:w="-572.0" w:type="dxa"/>
         <w:tblBorders>
           <w:top w:color="bfbfbf" w:space="0" w:sz="4" w:val="single"/>
           <w:left w:color="bfbfbf" w:space="0" w:sz="4" w:val="single"/>
@@ -535,12 +534,12 @@
         <w:tblLook w:val="0400"/>
       </w:tblPr>
       <w:tblGrid>
-        <w:gridCol w:w="2002.7444727541715"/>
-        <w:gridCol w:w="5633.511054491659"/>
+        <w:gridCol w:w="3810"/>
+        <w:gridCol w:w="3825"/>
         <w:tblGridChange w:id="0">
           <w:tblGrid>
-            <w:gridCol w:w="2002.7444727541715"/>
-            <w:gridCol w:w="5633.511054491659"/>
+            <w:gridCol w:w="3810"/>
+            <w:gridCol w:w="3825"/>
           </w:tblGrid>
         </w:tblGridChange>
       </w:tblGrid>
@@ -574,7 +573,6 @@
           <w:tcPr/>
           <w:p>
             <w:pPr>
-              <w:jc w:val="both"/>
               <w:rPr>
                 <w:rFonts w:ascii="Calibri" w:cs="Calibri" w:eastAsia="Calibri" w:hAnsi="Calibri"/>
                 <w:i w:val="1"/>
@@ -632,7 +630,6 @@
           </w:tcPr>
           <w:p>
             <w:pPr>
-              <w:jc w:val="both"/>
               <w:rPr>
                 <w:i w:val="1"/>
                 <w:sz w:val="20"/>
@@ -651,7 +648,6 @@
           </w:p>
           <w:p>
             <w:pPr>
-              <w:jc w:val="both"/>
               <w:rPr>
                 <w:rFonts w:ascii="Calibri" w:cs="Calibri" w:eastAsia="Calibri" w:hAnsi="Calibri"/>
                 <w:b w:val="1"/>
@@ -708,7 +704,6 @@
           </w:tcPr>
           <w:p>
             <w:pPr>
-              <w:jc w:val="both"/>
               <w:rPr>
                 <w:rFonts w:ascii="Calibri" w:cs="Calibri" w:eastAsia="Calibri" w:hAnsi="Calibri"/>
                 <w:i w:val="1"/>
@@ -762,7 +757,6 @@
           </w:tcPr>
           <w:p>
             <w:pPr>
-              <w:jc w:val="both"/>
               <w:rPr>
                 <w:i w:val="1"/>
                 <w:sz w:val="20"/>
@@ -781,7 +775,6 @@
           </w:p>
           <w:p>
             <w:pPr>
-              <w:jc w:val="both"/>
               <w:rPr>
                 <w:i w:val="1"/>
                 <w:sz w:val="20"/>
@@ -800,7 +793,6 @@
           </w:p>
           <w:p>
             <w:pPr>
-              <w:jc w:val="both"/>
               <w:rPr>
                 <w:i w:val="1"/>
                 <w:sz w:val="20"/>
@@ -820,68 +812,6 @@
               <w:rPr>
                 <w:rtl w:val="0"/>
               </w:rPr>
-            </w:r>
-          </w:p>
-        </w:tc>
-      </w:tr>
-      <w:tr>
-        <w:trPr>
-          <w:cantSplit w:val="0"/>
-          <w:trHeight w:val="440" w:hRule="atLeast"/>
-          <w:tblHeader w:val="0"/>
-        </w:trPr>
-        <w:tc>
-          <w:tcPr>
-            <w:vAlign w:val="center"/>
-          </w:tcPr>
-          <w:p>
-            <w:pPr>
-              <w:rPr>
-                <w:b w:val="1"/>
-                <w:color w:val="1f3864"/>
-                <w:sz w:val="28"/>
-                <w:szCs w:val="28"/>
-              </w:rPr>
-            </w:pPr>
-            <w:r>
-              <w:rPr>
-                <w:b w:val="1"/>
-                <w:color w:val="1f3864"/>
-                <w:sz w:val="28"/>
-                <w:szCs w:val="28"/>
-                <w:rtl w:val="0"/>
-              </w:rPr>
-              <w:t xml:space="preserve">2. Monitoreo del Plan de Trabajo </w:t>
-            </w:r>
-          </w:p>
-        </w:tc>
-      </w:tr>
-      <w:tr>
-        <w:trPr>
-          <w:cantSplit w:val="0"/>
-          <w:trHeight w:val="4074.408854166666" w:hRule="atLeast"/>
-          <w:tblHeader w:val="0"/>
-        </w:trPr>
-        <w:tc>
-          <w:tcPr>
-            <w:shd w:fill="d9e2f3" w:val="clear"/>
-            <w:vAlign w:val="center"/>
-          </w:tcPr>
-          <w:p>
-            <w:pPr>
-              <w:jc w:val="both"/>
-              <w:rPr>
-                <w:rFonts w:ascii="Calibri" w:cs="Calibri" w:eastAsia="Calibri" w:hAnsi="Calibri"/>
-                <w:color w:val="1f3864"/>
-              </w:rPr>
-            </w:pPr>
-            <w:r>
-              <w:rPr>
-                <w:rFonts w:ascii="Calibri" w:cs="Calibri" w:eastAsia="Calibri" w:hAnsi="Calibri"/>
-                <w:color w:val="1f3864"/>
-                <w:rtl w:val="0"/>
-              </w:rPr>
-              <w:t xml:space="preserve">Examina cuidadosamente tu plan de trabajo, enfocándote especialmente en la columna de estado de avance y ajustes.</w:t>
             </w:r>
           </w:p>
         </w:tc>
@@ -985,16 +915,3047 @@
         </w:rPr>
       </w:r>
     </w:p>
+    <w:p>
+      <w:pPr>
+        <w:rPr>
+          <w:color w:val="595959"/>
+          <w:sz w:val="24"/>
+          <w:szCs w:val="24"/>
+        </w:rPr>
+      </w:pPr>
+      <w:r>
+        <w:rPr>
+          <w:rtl w:val="0"/>
+        </w:rPr>
+      </w:r>
+    </w:p>
     <w:sdt>
       <w:sdtPr>
         <w:lock w:val="contentLocked"/>
-        <w:id w:val="1749181989"/>
+        <w:id w:val="-263689715"/>
         <w:tag w:val="goog_rdk_0"/>
       </w:sdtPr>
       <w:sdtContent>
         <w:tbl>
           <w:tblPr>
             <w:tblStyle w:val="Table3"/>
+            <w:tblW w:w="9330.0" w:type="dxa"/>
+            <w:jc w:val="left"/>
+            <w:tblBorders>
+              <w:top w:color="000000" w:space="0" w:sz="8" w:val="single"/>
+              <w:left w:color="000000" w:space="0" w:sz="8" w:val="single"/>
+              <w:bottom w:color="000000" w:space="0" w:sz="8" w:val="single"/>
+              <w:right w:color="000000" w:space="0" w:sz="8" w:val="single"/>
+              <w:insideH w:color="000000" w:space="0" w:sz="8" w:val="single"/>
+              <w:insideV w:color="000000" w:space="0" w:sz="8" w:val="single"/>
+            </w:tblBorders>
+            <w:tblLayout w:type="fixed"/>
+            <w:tblLook w:val="0600"/>
+          </w:tblPr>
+          <w:tblGrid>
+            <w:gridCol w:w="9330"/>
+            <w:tblGridChange w:id="0">
+              <w:tblGrid>
+                <w:gridCol w:w="9330"/>
+              </w:tblGrid>
+            </w:tblGridChange>
+          </w:tblGrid>
+          <w:tr>
+            <w:trPr>
+              <w:cantSplit w:val="0"/>
+              <w:tblHeader w:val="0"/>
+            </w:trPr>
+            <w:tc>
+              <w:tcPr>
+                <w:tcBorders>
+                  <w:top w:color="bfbfbf" w:space="0" w:sz="4" w:val="single"/>
+                  <w:left w:color="bfbfbf" w:space="0" w:sz="4" w:val="single"/>
+                  <w:bottom w:color="bfbfbf" w:space="0" w:sz="4" w:val="single"/>
+                  <w:right w:color="bfbfbf" w:space="0" w:sz="4" w:val="single"/>
+                </w:tcBorders>
+                <w:shd w:fill="auto" w:val="clear"/>
+                <w:tcMar>
+                  <w:top w:w="100.0" w:type="dxa"/>
+                  <w:left w:w="100.0" w:type="dxa"/>
+                  <w:bottom w:w="100.0" w:type="dxa"/>
+                  <w:right w:w="100.0" w:type="dxa"/>
+                </w:tcMar>
+                <w:vAlign w:val="top"/>
+              </w:tcPr>
+              <w:p>
+                <w:pPr>
+                  <w:rPr>
+                    <w:color w:val="595959"/>
+                    <w:sz w:val="24"/>
+                    <w:szCs w:val="24"/>
+                  </w:rPr>
+                </w:pPr>
+                <w:r>
+                  <w:rPr>
+                    <w:b w:val="1"/>
+                    <w:color w:val="1f3864"/>
+                    <w:sz w:val="28"/>
+                    <w:szCs w:val="28"/>
+                    <w:rtl w:val="0"/>
+                  </w:rPr>
+                  <w:t xml:space="preserve">2. Monitoreo del Plan de Trabajo </w:t>
+                </w:r>
+                <w:r>
+                  <w:rPr>
+                    <w:rtl w:val="0"/>
+                  </w:rPr>
+                </w:r>
+              </w:p>
+            </w:tc>
+          </w:tr>
+          <w:tr>
+            <w:trPr>
+              <w:cantSplit w:val="0"/>
+              <w:tblHeader w:val="0"/>
+            </w:trPr>
+            <w:tc>
+              <w:tcPr>
+                <w:tcBorders>
+                  <w:top w:color="bfbfbf" w:space="0" w:sz="4" w:val="single"/>
+                  <w:left w:color="bfbfbf" w:space="0" w:sz="4" w:val="single"/>
+                  <w:bottom w:color="bfbfbf" w:space="0" w:sz="4" w:val="single"/>
+                  <w:right w:color="bfbfbf" w:space="0" w:sz="4" w:val="single"/>
+                </w:tcBorders>
+                <w:shd w:fill="d9e2f3" w:val="clear"/>
+                <w:vAlign w:val="center"/>
+              </w:tcPr>
+              <w:p>
+                <w:pPr>
+                  <w:jc w:val="both"/>
+                  <w:rPr>
+                    <w:color w:val="1f3864"/>
+                  </w:rPr>
+                </w:pPr>
+                <w:r>
+                  <w:rPr>
+                    <w:color w:val="1f3864"/>
+                    <w:rtl w:val="0"/>
+                  </w:rPr>
+                  <w:t xml:space="preserve">Examina cuidadosamente tu plan de trabajo, enfocándote especialmente en la columna de estado de avance y ajustes.</w:t>
+                </w:r>
+              </w:p>
+            </w:tc>
+          </w:tr>
+        </w:tbl>
+      </w:sdtContent>
+    </w:sdt>
+    <w:p>
+      <w:pPr>
+        <w:rPr>
+          <w:color w:val="595959"/>
+          <w:sz w:val="24"/>
+          <w:szCs w:val="24"/>
+        </w:rPr>
+      </w:pPr>
+      <w:r>
+        <w:rPr>
+          <w:rtl w:val="0"/>
+        </w:rPr>
+      </w:r>
+    </w:p>
+    <w:sdt>
+      <w:sdtPr>
+        <w:lock w:val="contentLocked"/>
+        <w:id w:val="-48901982"/>
+        <w:tag w:val="goog_rdk_1"/>
+      </w:sdtPr>
+      <w:sdtContent>
+        <w:tbl>
+          <w:tblPr>
+            <w:tblStyle w:val="Table4"/>
+            <w:tblW w:w="9330.0" w:type="dxa"/>
+            <w:jc w:val="left"/>
+            <w:tblBorders>
+              <w:top w:color="000000" w:space="0" w:sz="8" w:val="single"/>
+              <w:left w:color="000000" w:space="0" w:sz="8" w:val="single"/>
+              <w:bottom w:color="000000" w:space="0" w:sz="8" w:val="single"/>
+              <w:right w:color="000000" w:space="0" w:sz="8" w:val="single"/>
+              <w:insideH w:color="000000" w:space="0" w:sz="8" w:val="single"/>
+              <w:insideV w:color="000000" w:space="0" w:sz="8" w:val="single"/>
+            </w:tblBorders>
+            <w:tblLayout w:type="fixed"/>
+            <w:tblLook w:val="0600"/>
+          </w:tblPr>
+          <w:tblGrid>
+            <w:gridCol w:w="1410"/>
+            <w:gridCol w:w="1230"/>
+            <w:gridCol w:w="1110"/>
+            <w:gridCol w:w="1065"/>
+            <w:gridCol w:w="1155"/>
+            <w:gridCol w:w="1365"/>
+            <w:gridCol w:w="1050"/>
+            <w:gridCol w:w="945"/>
+            <w:tblGridChange w:id="0">
+              <w:tblGrid>
+                <w:gridCol w:w="1410"/>
+                <w:gridCol w:w="1230"/>
+                <w:gridCol w:w="1110"/>
+                <w:gridCol w:w="1065"/>
+                <w:gridCol w:w="1155"/>
+                <w:gridCol w:w="1365"/>
+                <w:gridCol w:w="1050"/>
+                <w:gridCol w:w="945"/>
+              </w:tblGrid>
+            </w:tblGridChange>
+          </w:tblGrid>
+          <w:tr>
+            <w:trPr>
+              <w:cantSplit w:val="0"/>
+              <w:trHeight w:val="440" w:hRule="atLeast"/>
+              <w:tblHeader w:val="0"/>
+            </w:trPr>
+            <w:tc>
+              <w:tcPr>
+                <w:gridSpan w:val="8"/>
+                <w:vMerge w:val="restart"/>
+                <w:tcBorders>
+                  <w:top w:color="bfbfbf" w:space="0" w:sz="4" w:val="single"/>
+                  <w:left w:color="bfbfbf" w:space="0" w:sz="4" w:val="single"/>
+                  <w:bottom w:color="bfbfbf" w:space="0" w:sz="4" w:val="single"/>
+                  <w:right w:color="bfbfbf" w:space="0" w:sz="4" w:val="single"/>
+                </w:tcBorders>
+                <w:shd w:fill="auto" w:val="clear"/>
+                <w:tcMar>
+                  <w:top w:w="100.0" w:type="dxa"/>
+                  <w:left w:w="100.0" w:type="dxa"/>
+                  <w:bottom w:w="100.0" w:type="dxa"/>
+                  <w:right w:w="100.0" w:type="dxa"/>
+                </w:tcMar>
+                <w:vAlign w:val="top"/>
+              </w:tcPr>
+              <w:p>
+                <w:pPr>
+                  <w:jc w:val="center"/>
+                  <w:rPr>
+                    <w:color w:val="595959"/>
+                    <w:sz w:val="24"/>
+                    <w:szCs w:val="24"/>
+                  </w:rPr>
+                </w:pPr>
+                <w:r>
+                  <w:rPr>
+                    <w:color w:val="1f3864"/>
+                    <w:sz w:val="18"/>
+                    <w:szCs w:val="18"/>
+                    <w:rtl w:val="0"/>
+                  </w:rPr>
+                  <w:t xml:space="preserve">Plan de Trabajo</w:t>
+                </w:r>
+                <w:r>
+                  <w:rPr>
+                    <w:rtl w:val="0"/>
+                  </w:rPr>
+                </w:r>
+              </w:p>
+            </w:tc>
+          </w:tr>
+          <w:tr>
+            <w:trPr>
+              <w:cantSplit w:val="0"/>
+              <w:trHeight w:val="440" w:hRule="atLeast"/>
+              <w:tblHeader w:val="0"/>
+            </w:trPr>
+            <w:tc>
+              <w:tcPr>
+                <w:gridSpan w:val="8"/>
+                <w:vMerge w:val="continue"/>
+                <w:tcBorders>
+                  <w:top w:color="bfbfbf" w:space="0" w:sz="4" w:val="single"/>
+                  <w:left w:color="bfbfbf" w:space="0" w:sz="4" w:val="single"/>
+                  <w:bottom w:color="bfbfbf" w:space="0" w:sz="4" w:val="single"/>
+                  <w:right w:color="bfbfbf" w:space="0" w:sz="4" w:val="single"/>
+                </w:tcBorders>
+                <w:shd w:fill="auto" w:val="clear"/>
+                <w:tcMar>
+                  <w:top w:w="100.0" w:type="dxa"/>
+                  <w:left w:w="100.0" w:type="dxa"/>
+                  <w:bottom w:w="100.0" w:type="dxa"/>
+                  <w:right w:w="100.0" w:type="dxa"/>
+                </w:tcMar>
+                <w:vAlign w:val="top"/>
+              </w:tcPr>
+              <w:p>
+                <w:pPr>
+                  <w:keepNext w:val="0"/>
+                  <w:keepLines w:val="0"/>
+                  <w:pageBreakBefore w:val="0"/>
+                  <w:widowControl w:val="0"/>
+                  <w:pBdr>
+                    <w:top w:space="0" w:sz="0" w:val="nil"/>
+                    <w:left w:space="0" w:sz="0" w:val="nil"/>
+                    <w:bottom w:space="0" w:sz="0" w:val="nil"/>
+                    <w:right w:space="0" w:sz="0" w:val="nil"/>
+                    <w:between w:space="0" w:sz="0" w:val="nil"/>
+                  </w:pBdr>
+                  <w:shd w:fill="auto" w:val="clear"/>
+                  <w:spacing w:after="0" w:before="0" w:line="240" w:lineRule="auto"/>
+                  <w:ind w:left="0" w:right="0" w:firstLine="0"/>
+                  <w:jc w:val="left"/>
+                  <w:rPr>
+                    <w:color w:val="595959"/>
+                    <w:sz w:val="24"/>
+                    <w:szCs w:val="24"/>
+                  </w:rPr>
+                </w:pPr>
+                <w:r>
+                  <w:rPr>
+                    <w:rtl w:val="0"/>
+                  </w:rPr>
+                </w:r>
+              </w:p>
+            </w:tc>
+          </w:tr>
+          <w:tr>
+            <w:trPr>
+              <w:cantSplit w:val="0"/>
+              <w:tblHeader w:val="0"/>
+            </w:trPr>
+            <w:tc>
+              <w:tcPr>
+                <w:tcBorders>
+                  <w:top w:color="bfbfbf" w:space="0" w:sz="4" w:val="single"/>
+                  <w:left w:color="bfbfbf" w:space="0" w:sz="4" w:val="single"/>
+                  <w:bottom w:color="bfbfbf" w:space="0" w:sz="4" w:val="single"/>
+                  <w:right w:color="bfbfbf" w:space="0" w:sz="4" w:val="single"/>
+                </w:tcBorders>
+                <w:vAlign w:val="center"/>
+              </w:tcPr>
+              <w:p>
+                <w:pPr>
+                  <w:jc w:val="center"/>
+                  <w:rPr>
+                    <w:color w:val="1f3864"/>
+                    <w:sz w:val="18"/>
+                    <w:szCs w:val="18"/>
+                  </w:rPr>
+                </w:pPr>
+                <w:r>
+                  <w:rPr>
+                    <w:color w:val="1f3864"/>
+                    <w:sz w:val="18"/>
+                    <w:szCs w:val="18"/>
+                    <w:rtl w:val="0"/>
+                  </w:rPr>
+                  <w:t xml:space="preserve">Competencia o unidades de competencias</w:t>
+                </w:r>
+              </w:p>
+            </w:tc>
+            <w:tc>
+              <w:tcPr>
+                <w:tcBorders>
+                  <w:top w:color="bfbfbf" w:space="0" w:sz="4" w:val="single"/>
+                  <w:left w:color="bfbfbf" w:space="0" w:sz="4" w:val="single"/>
+                  <w:bottom w:color="bfbfbf" w:space="0" w:sz="4" w:val="single"/>
+                  <w:right w:color="bfbfbf" w:space="0" w:sz="4" w:val="single"/>
+                </w:tcBorders>
+                <w:vAlign w:val="center"/>
+              </w:tcPr>
+              <w:p>
+                <w:pPr>
+                  <w:jc w:val="center"/>
+                  <w:rPr>
+                    <w:color w:val="1f3864"/>
+                    <w:sz w:val="18"/>
+                    <w:szCs w:val="18"/>
+                  </w:rPr>
+                </w:pPr>
+                <w:r>
+                  <w:rPr>
+                    <w:color w:val="1f3864"/>
+                    <w:sz w:val="18"/>
+                    <w:szCs w:val="18"/>
+                    <w:rtl w:val="0"/>
+                  </w:rPr>
+                  <w:t xml:space="preserve">Actividades</w:t>
+                </w:r>
+              </w:p>
+            </w:tc>
+            <w:tc>
+              <w:tcPr>
+                <w:tcBorders>
+                  <w:top w:color="bfbfbf" w:space="0" w:sz="4" w:val="single"/>
+                  <w:left w:color="bfbfbf" w:space="0" w:sz="4" w:val="single"/>
+                  <w:bottom w:color="bfbfbf" w:space="0" w:sz="4" w:val="single"/>
+                  <w:right w:color="bfbfbf" w:space="0" w:sz="4" w:val="single"/>
+                </w:tcBorders>
+                <w:vAlign w:val="center"/>
+              </w:tcPr>
+              <w:p>
+                <w:pPr>
+                  <w:jc w:val="center"/>
+                  <w:rPr>
+                    <w:color w:val="1f3864"/>
+                    <w:sz w:val="18"/>
+                    <w:szCs w:val="18"/>
+                  </w:rPr>
+                </w:pPr>
+                <w:r>
+                  <w:rPr>
+                    <w:color w:val="1f3864"/>
+                    <w:sz w:val="18"/>
+                    <w:szCs w:val="18"/>
+                    <w:rtl w:val="0"/>
+                  </w:rPr>
+                  <w:t xml:space="preserve">Recursos</w:t>
+                </w:r>
+              </w:p>
+            </w:tc>
+            <w:tc>
+              <w:tcPr>
+                <w:tcBorders>
+                  <w:top w:color="bfbfbf" w:space="0" w:sz="4" w:val="single"/>
+                  <w:left w:color="bfbfbf" w:space="0" w:sz="4" w:val="single"/>
+                  <w:bottom w:color="bfbfbf" w:space="0" w:sz="4" w:val="single"/>
+                  <w:right w:color="bfbfbf" w:space="0" w:sz="4" w:val="single"/>
+                </w:tcBorders>
+                <w:vAlign w:val="center"/>
+              </w:tcPr>
+              <w:p>
+                <w:pPr>
+                  <w:jc w:val="center"/>
+                  <w:rPr>
+                    <w:color w:val="1f3864"/>
+                    <w:sz w:val="18"/>
+                    <w:szCs w:val="18"/>
+                  </w:rPr>
+                </w:pPr>
+                <w:r>
+                  <w:rPr>
+                    <w:color w:val="1f3864"/>
+                    <w:sz w:val="18"/>
+                    <w:szCs w:val="18"/>
+                    <w:rtl w:val="0"/>
+                  </w:rPr>
+                  <w:t xml:space="preserve">Duración de la actividad</w:t>
+                </w:r>
+              </w:p>
+            </w:tc>
+            <w:tc>
+              <w:tcPr>
+                <w:tcBorders>
+                  <w:top w:color="bfbfbf" w:space="0" w:sz="4" w:val="single"/>
+                  <w:left w:color="bfbfbf" w:space="0" w:sz="4" w:val="single"/>
+                  <w:bottom w:color="bfbfbf" w:space="0" w:sz="4" w:val="single"/>
+                  <w:right w:color="bfbfbf" w:space="0" w:sz="4" w:val="single"/>
+                </w:tcBorders>
+                <w:vAlign w:val="center"/>
+              </w:tcPr>
+              <w:p>
+                <w:pPr>
+                  <w:jc w:val="center"/>
+                  <w:rPr>
+                    <w:color w:val="1f3864"/>
+                    <w:sz w:val="18"/>
+                    <w:szCs w:val="18"/>
+                  </w:rPr>
+                </w:pPr>
+                <w:r>
+                  <w:rPr>
+                    <w:color w:val="1f3864"/>
+                    <w:sz w:val="18"/>
+                    <w:szCs w:val="18"/>
+                    <w:rtl w:val="0"/>
+                  </w:rPr>
+                  <w:t xml:space="preserve">Responsable</w:t>
+                </w:r>
+                <w:r>
+                  <w:rPr>
+                    <w:color w:val="1f3864"/>
+                    <w:sz w:val="18"/>
+                    <w:szCs w:val="18"/>
+                    <w:vertAlign w:val="superscript"/>
+                  </w:rPr>
+                  <w:footnoteReference w:customMarkFollows="0" w:id="0"/>
+                </w:r>
+                <w:r>
+                  <w:rPr>
+                    <w:rtl w:val="0"/>
+                  </w:rPr>
+                </w:r>
+              </w:p>
+            </w:tc>
+            <w:tc>
+              <w:tcPr>
+                <w:tcBorders>
+                  <w:top w:color="bfbfbf" w:space="0" w:sz="4" w:val="single"/>
+                  <w:left w:color="bfbfbf" w:space="0" w:sz="4" w:val="single"/>
+                  <w:bottom w:color="bfbfbf" w:space="0" w:sz="4" w:val="single"/>
+                  <w:right w:color="bfbfbf" w:space="0" w:sz="4" w:val="single"/>
+                </w:tcBorders>
+                <w:vAlign w:val="center"/>
+              </w:tcPr>
+              <w:p>
+                <w:pPr>
+                  <w:jc w:val="center"/>
+                  <w:rPr>
+                    <w:color w:val="1f3864"/>
+                    <w:sz w:val="18"/>
+                    <w:szCs w:val="18"/>
+                  </w:rPr>
+                </w:pPr>
+                <w:r>
+                  <w:rPr>
+                    <w:color w:val="1f3864"/>
+                    <w:sz w:val="18"/>
+                    <w:szCs w:val="18"/>
+                    <w:rtl w:val="0"/>
+                  </w:rPr>
+                  <w:t xml:space="preserve">Observaciones</w:t>
+                </w:r>
+              </w:p>
+            </w:tc>
+            <w:tc>
+              <w:tcPr>
+                <w:tcBorders>
+                  <w:top w:color="bfbfbf" w:space="0" w:sz="4" w:val="single"/>
+                  <w:left w:color="bfbfbf" w:space="0" w:sz="4" w:val="single"/>
+                  <w:bottom w:color="bfbfbf" w:space="0" w:sz="4" w:val="single"/>
+                  <w:right w:color="bfbfbf" w:space="0" w:sz="4" w:val="single"/>
+                </w:tcBorders>
+                <w:vAlign w:val="center"/>
+              </w:tcPr>
+              <w:p>
+                <w:pPr>
+                  <w:jc w:val="center"/>
+                  <w:rPr>
+                    <w:color w:val="1f3864"/>
+                    <w:sz w:val="18"/>
+                    <w:szCs w:val="18"/>
+                  </w:rPr>
+                </w:pPr>
+                <w:r>
+                  <w:rPr>
+                    <w:color w:val="1f3864"/>
+                    <w:sz w:val="18"/>
+                    <w:szCs w:val="18"/>
+                    <w:rtl w:val="0"/>
+                  </w:rPr>
+                  <w:t xml:space="preserve">Estado de avance</w:t>
+                </w:r>
+              </w:p>
+            </w:tc>
+            <w:tc>
+              <w:tcPr>
+                <w:tcBorders>
+                  <w:top w:color="bfbfbf" w:space="0" w:sz="4" w:val="single"/>
+                  <w:left w:color="bfbfbf" w:space="0" w:sz="4" w:val="single"/>
+                  <w:bottom w:color="bfbfbf" w:space="0" w:sz="4" w:val="single"/>
+                  <w:right w:color="bfbfbf" w:space="0" w:sz="4" w:val="single"/>
+                </w:tcBorders>
+                <w:vAlign w:val="center"/>
+              </w:tcPr>
+              <w:p>
+                <w:pPr>
+                  <w:jc w:val="center"/>
+                  <w:rPr>
+                    <w:color w:val="1f3864"/>
+                    <w:sz w:val="18"/>
+                    <w:szCs w:val="18"/>
+                  </w:rPr>
+                </w:pPr>
+                <w:r>
+                  <w:rPr>
+                    <w:color w:val="1f3864"/>
+                    <w:sz w:val="18"/>
+                    <w:szCs w:val="18"/>
+                    <w:rtl w:val="0"/>
+                  </w:rPr>
+                  <w:t xml:space="preserve">Ajustes</w:t>
+                </w:r>
+              </w:p>
+            </w:tc>
+          </w:tr>
+          <w:tr>
+            <w:trPr>
+              <w:cantSplit w:val="0"/>
+              <w:trHeight w:val="440" w:hRule="atLeast"/>
+              <w:tblHeader w:val="0"/>
+            </w:trPr>
+            <w:tc>
+              <w:tcPr>
+                <w:tcBorders>
+                  <w:top w:color="bfbfbf" w:space="0" w:sz="4" w:val="single"/>
+                  <w:left w:color="bfbfbf" w:space="0" w:sz="4" w:val="single"/>
+                  <w:bottom w:color="bfbfbf" w:space="0" w:sz="4" w:val="single"/>
+                  <w:right w:color="bfbfbf" w:space="0" w:sz="4" w:val="single"/>
+                </w:tcBorders>
+              </w:tcPr>
+              <w:p>
+                <w:pPr>
+                  <w:jc w:val="both"/>
+                  <w:rPr>
+                    <w:sz w:val="18"/>
+                    <w:szCs w:val="18"/>
+                  </w:rPr>
+                </w:pPr>
+                <w:r>
+                  <w:rPr>
+                    <w:sz w:val="18"/>
+                    <w:szCs w:val="18"/>
+                    <w:rtl w:val="0"/>
+                  </w:rPr>
+                  <w:t xml:space="preserve">Construir Modelos de datos para soportar los requerimientos de la organización acuerdo a un diseño definido y escalable en el tiempo.</w:t>
+                </w:r>
+              </w:p>
+              <w:p>
+                <w:pPr>
+                  <w:jc w:val="both"/>
+                  <w:rPr>
+                    <w:sz w:val="18"/>
+                    <w:szCs w:val="18"/>
+                  </w:rPr>
+                </w:pPr>
+                <w:r>
+                  <w:rPr>
+                    <w:rtl w:val="0"/>
+                  </w:rPr>
+                </w:r>
+              </w:p>
+            </w:tc>
+            <w:tc>
+              <w:tcPr>
+                <w:tcBorders>
+                  <w:top w:color="bfbfbf" w:space="0" w:sz="4" w:val="single"/>
+                  <w:left w:color="bfbfbf" w:space="0" w:sz="4" w:val="single"/>
+                  <w:bottom w:color="bfbfbf" w:space="0" w:sz="4" w:val="single"/>
+                  <w:right w:color="bfbfbf" w:space="0" w:sz="4" w:val="single"/>
+                </w:tcBorders>
+              </w:tcPr>
+              <w:p>
+                <w:pPr>
+                  <w:jc w:val="both"/>
+                  <w:rPr>
+                    <w:i w:val="1"/>
+                    <w:sz w:val="18"/>
+                    <w:szCs w:val="18"/>
+                  </w:rPr>
+                </w:pPr>
+                <w:r>
+                  <w:rPr>
+                    <w:i w:val="1"/>
+                    <w:sz w:val="18"/>
+                    <w:szCs w:val="18"/>
+                    <w:rtl w:val="0"/>
+                  </w:rPr>
+                  <w:t xml:space="preserve">Diseñar esquema de base de datos</w:t>
+                </w:r>
+              </w:p>
+            </w:tc>
+            <w:tc>
+              <w:tcPr>
+                <w:tcBorders>
+                  <w:top w:color="bfbfbf" w:space="0" w:sz="4" w:val="single"/>
+                  <w:left w:color="bfbfbf" w:space="0" w:sz="4" w:val="single"/>
+                  <w:bottom w:color="bfbfbf" w:space="0" w:sz="4" w:val="single"/>
+                  <w:right w:color="bfbfbf" w:space="0" w:sz="4" w:val="single"/>
+                </w:tcBorders>
+              </w:tcPr>
+              <w:p>
+                <w:pPr>
+                  <w:jc w:val="both"/>
+                  <w:rPr>
+                    <w:i w:val="1"/>
+                    <w:sz w:val="18"/>
+                    <w:szCs w:val="18"/>
+                  </w:rPr>
+                </w:pPr>
+                <w:r>
+                  <w:rPr>
+                    <w:i w:val="1"/>
+                    <w:sz w:val="18"/>
+                    <w:szCs w:val="18"/>
+                    <w:rtl w:val="0"/>
+                  </w:rPr>
+                  <w:t xml:space="preserve">Herramienta de modelado (Usamos drawsql hasta que no nos soportó más tablas)</w:t>
+                  <w:br w:type="textWrapping"/>
+                </w:r>
+              </w:p>
+              <w:p>
+                <w:pPr>
+                  <w:jc w:val="both"/>
+                  <w:rPr>
+                    <w:i w:val="1"/>
+                    <w:sz w:val="18"/>
+                    <w:szCs w:val="18"/>
+                  </w:rPr>
+                </w:pPr>
+                <w:r>
+                  <w:rPr>
+                    <w:i w:val="1"/>
+                    <w:sz w:val="18"/>
+                    <w:szCs w:val="18"/>
+                    <w:rtl w:val="0"/>
+                  </w:rPr>
+                  <w:t xml:space="preserve">Acceso a Supabase </w:t>
+                  <w:br w:type="textWrapping"/>
+                </w:r>
+              </w:p>
+              <w:p>
+                <w:pPr>
+                  <w:jc w:val="both"/>
+                  <w:rPr>
+                    <w:i w:val="1"/>
+                    <w:sz w:val="18"/>
+                    <w:szCs w:val="18"/>
+                  </w:rPr>
+                </w:pPr>
+                <w:r>
+                  <w:rPr>
+                    <w:i w:val="1"/>
+                    <w:sz w:val="18"/>
+                    <w:szCs w:val="18"/>
+                    <w:rtl w:val="0"/>
+                  </w:rPr>
+                  <w:t xml:space="preserve">Reuniones de revisión con el equipo</w:t>
+                </w:r>
+              </w:p>
+              <w:p>
+                <w:pPr>
+                  <w:jc w:val="both"/>
+                  <w:rPr>
+                    <w:i w:val="1"/>
+                    <w:sz w:val="18"/>
+                    <w:szCs w:val="18"/>
+                  </w:rPr>
+                </w:pPr>
+                <w:r>
+                  <w:rPr>
+                    <w:rtl w:val="0"/>
+                  </w:rPr>
+                </w:r>
+              </w:p>
+            </w:tc>
+            <w:tc>
+              <w:tcPr>
+                <w:tcBorders>
+                  <w:top w:color="bfbfbf" w:space="0" w:sz="4" w:val="single"/>
+                  <w:left w:color="bfbfbf" w:space="0" w:sz="4" w:val="single"/>
+                  <w:bottom w:color="bfbfbf" w:space="0" w:sz="4" w:val="single"/>
+                  <w:right w:color="bfbfbf" w:space="0" w:sz="4" w:val="single"/>
+                </w:tcBorders>
+              </w:tcPr>
+              <w:p>
+                <w:pPr>
+                  <w:jc w:val="both"/>
+                  <w:rPr>
+                    <w:b w:val="1"/>
+                    <w:sz w:val="18"/>
+                    <w:szCs w:val="18"/>
+                  </w:rPr>
+                </w:pPr>
+                <w:r>
+                  <w:rPr>
+                    <w:i w:val="1"/>
+                    <w:sz w:val="18"/>
+                    <w:szCs w:val="18"/>
+                    <w:rtl w:val="0"/>
+                  </w:rPr>
+                  <w:t xml:space="preserve">5 días hábiles</w:t>
+                </w:r>
+                <w:r>
+                  <w:rPr>
+                    <w:rtl w:val="0"/>
+                  </w:rPr>
+                </w:r>
+              </w:p>
+            </w:tc>
+            <w:tc>
+              <w:tcPr>
+                <w:tcBorders>
+                  <w:top w:color="bfbfbf" w:space="0" w:sz="4" w:val="single"/>
+                  <w:left w:color="bfbfbf" w:space="0" w:sz="4" w:val="single"/>
+                  <w:bottom w:color="bfbfbf" w:space="0" w:sz="4" w:val="single"/>
+                  <w:right w:color="bfbfbf" w:space="0" w:sz="4" w:val="single"/>
+                </w:tcBorders>
+              </w:tcPr>
+              <w:p>
+                <w:pPr>
+                  <w:jc w:val="both"/>
+                  <w:rPr>
+                    <w:i w:val="1"/>
+                    <w:sz w:val="18"/>
+                    <w:szCs w:val="18"/>
+                  </w:rPr>
+                </w:pPr>
+                <w:r>
+                  <w:rPr>
+                    <w:i w:val="1"/>
+                    <w:sz w:val="18"/>
+                    <w:szCs w:val="18"/>
+                    <w:rtl w:val="0"/>
+                  </w:rPr>
+                  <w:t xml:space="preserve">Brayan Gatica</w:t>
+                </w:r>
+                <w:r>
+                  <w:rPr>
+                    <w:rtl w:val="0"/>
+                  </w:rPr>
+                </w:r>
+              </w:p>
+            </w:tc>
+            <w:tc>
+              <w:tcPr>
+                <w:tcBorders>
+                  <w:top w:color="bfbfbf" w:space="0" w:sz="4" w:val="single"/>
+                  <w:left w:color="bfbfbf" w:space="0" w:sz="4" w:val="single"/>
+                  <w:bottom w:color="bfbfbf" w:space="0" w:sz="4" w:val="single"/>
+                  <w:right w:color="bfbfbf" w:space="0" w:sz="4" w:val="single"/>
+                </w:tcBorders>
+              </w:tcPr>
+              <w:p>
+                <w:pPr>
+                  <w:jc w:val="both"/>
+                  <w:rPr>
+                    <w:i w:val="1"/>
+                    <w:sz w:val="18"/>
+                    <w:szCs w:val="18"/>
+                  </w:rPr>
+                </w:pPr>
+                <w:r>
+                  <w:rPr>
+                    <w:i w:val="1"/>
+                    <w:sz w:val="18"/>
+                    <w:szCs w:val="18"/>
+                    <w:rtl w:val="0"/>
+                  </w:rPr>
+                  <w:t xml:space="preserve">Una dificultad fue la correcta traducción de la lógica del negocio a estructuras relacionales. Sin embargo, el trabajo colaborativo y la revisión conjunta facilitaron el proceso y aseguraron un diseño coherente.</w:t>
+                </w:r>
+                <w:r>
+                  <w:rPr>
+                    <w:rtl w:val="0"/>
+                  </w:rPr>
+                </w:r>
+              </w:p>
+            </w:tc>
+            <w:tc>
+              <w:tcPr>
+                <w:tcBorders>
+                  <w:top w:color="bfbfbf" w:space="0" w:sz="4" w:val="single"/>
+                  <w:left w:color="bfbfbf" w:space="0" w:sz="4" w:val="single"/>
+                  <w:bottom w:color="bfbfbf" w:space="0" w:sz="4" w:val="single"/>
+                  <w:right w:color="bfbfbf" w:space="0" w:sz="4" w:val="single"/>
+                </w:tcBorders>
+              </w:tcPr>
+              <w:p>
+                <w:pPr>
+                  <w:jc w:val="both"/>
+                  <w:rPr>
+                    <w:i w:val="1"/>
+                    <w:sz w:val="16"/>
+                    <w:szCs w:val="16"/>
+                  </w:rPr>
+                </w:pPr>
+                <w:r>
+                  <w:rPr>
+                    <w:i w:val="1"/>
+                    <w:sz w:val="18"/>
+                    <w:szCs w:val="18"/>
+                    <w:rtl w:val="0"/>
+                  </w:rPr>
+                  <w:t xml:space="preserve">Completado</w:t>
+                </w:r>
+                <w:r>
+                  <w:rPr>
+                    <w:rtl w:val="0"/>
+                  </w:rPr>
+                </w:r>
+              </w:p>
+            </w:tc>
+            <w:tc>
+              <w:tcPr>
+                <w:tcBorders>
+                  <w:top w:color="bfbfbf" w:space="0" w:sz="4" w:val="single"/>
+                  <w:left w:color="bfbfbf" w:space="0" w:sz="4" w:val="single"/>
+                  <w:bottom w:color="bfbfbf" w:space="0" w:sz="4" w:val="single"/>
+                  <w:right w:color="bfbfbf" w:space="0" w:sz="4" w:val="single"/>
+                </w:tcBorders>
+              </w:tcPr>
+              <w:p>
+                <w:pPr>
+                  <w:jc w:val="both"/>
+                  <w:rPr>
+                    <w:i w:val="1"/>
+                    <w:sz w:val="18"/>
+                    <w:szCs w:val="18"/>
+                  </w:rPr>
+                </w:pPr>
+                <w:r>
+                  <w:rPr>
+                    <w:i w:val="1"/>
+                    <w:sz w:val="18"/>
+                    <w:szCs w:val="18"/>
+                    <w:rtl w:val="0"/>
+                  </w:rPr>
+                  <w:t xml:space="preserve">Se ajustaron algunas relaciones entre tablas para optimizar las consultas y evitar redundancias de datos.</w:t>
+                </w:r>
+                <w:r>
+                  <w:rPr>
+                    <w:rtl w:val="0"/>
+                  </w:rPr>
+                </w:r>
+              </w:p>
+            </w:tc>
+          </w:tr>
+          <w:tr>
+            <w:trPr>
+              <w:cantSplit w:val="0"/>
+              <w:trHeight w:val="440" w:hRule="atLeast"/>
+              <w:tblHeader w:val="0"/>
+            </w:trPr>
+            <w:tc>
+              <w:tcPr>
+                <w:tcBorders>
+                  <w:top w:color="bfbfbf" w:space="0" w:sz="4" w:val="single"/>
+                  <w:left w:color="bfbfbf" w:space="0" w:sz="4" w:val="single"/>
+                  <w:bottom w:color="bfbfbf" w:space="0" w:sz="4" w:val="single"/>
+                  <w:right w:color="bfbfbf" w:space="0" w:sz="4" w:val="single"/>
+                </w:tcBorders>
+              </w:tcPr>
+              <w:p>
+                <w:pPr>
+                  <w:jc w:val="both"/>
+                  <w:rPr>
+                    <w:sz w:val="18"/>
+                    <w:szCs w:val="18"/>
+                  </w:rPr>
+                </w:pPr>
+                <w:r>
+                  <w:rPr>
+                    <w:sz w:val="18"/>
+                    <w:szCs w:val="18"/>
+                    <w:rtl w:val="0"/>
+                  </w:rPr>
+                  <w:t xml:space="preserve">Construir el modelo arquitectónico de una solución sistémica que soporte los procesos de negocio de acuerdo los requerimientos de la organización y estándares industria.</w:t>
+                </w:r>
+              </w:p>
+            </w:tc>
+            <w:tc>
+              <w:tcPr>
+                <w:tcBorders>
+                  <w:top w:color="bfbfbf" w:space="0" w:sz="4" w:val="single"/>
+                  <w:left w:color="bfbfbf" w:space="0" w:sz="4" w:val="single"/>
+                  <w:bottom w:color="bfbfbf" w:space="0" w:sz="4" w:val="single"/>
+                  <w:right w:color="bfbfbf" w:space="0" w:sz="4" w:val="single"/>
+                </w:tcBorders>
+              </w:tcPr>
+              <w:p>
+                <w:pPr>
+                  <w:jc w:val="both"/>
+                  <w:rPr>
+                    <w:i w:val="1"/>
+                    <w:sz w:val="18"/>
+                    <w:szCs w:val="18"/>
+                  </w:rPr>
+                </w:pPr>
+                <w:r>
+                  <w:rPr>
+                    <w:i w:val="1"/>
+                    <w:sz w:val="18"/>
+                    <w:szCs w:val="18"/>
+                    <w:rtl w:val="0"/>
+                  </w:rPr>
+                  <w:t xml:space="preserve">Diseñar diagrama de arquitectura general</w:t>
+                </w:r>
+              </w:p>
+            </w:tc>
+            <w:tc>
+              <w:tcPr>
+                <w:tcBorders>
+                  <w:top w:color="bfbfbf" w:space="0" w:sz="4" w:val="single"/>
+                  <w:left w:color="bfbfbf" w:space="0" w:sz="4" w:val="single"/>
+                  <w:bottom w:color="bfbfbf" w:space="0" w:sz="4" w:val="single"/>
+                  <w:right w:color="bfbfbf" w:space="0" w:sz="4" w:val="single"/>
+                </w:tcBorders>
+              </w:tcPr>
+              <w:p>
+                <w:pPr>
+                  <w:jc w:val="both"/>
+                  <w:rPr>
+                    <w:i w:val="1"/>
+                    <w:sz w:val="18"/>
+                    <w:szCs w:val="18"/>
+                  </w:rPr>
+                </w:pPr>
+                <w:r>
+                  <w:rPr>
+                    <w:i w:val="1"/>
+                    <w:sz w:val="18"/>
+                    <w:szCs w:val="18"/>
+                    <w:rtl w:val="0"/>
+                  </w:rPr>
+                  <w:t xml:space="preserve">Herramientas de diagramación (Draw.io)</w:t>
+                </w:r>
+              </w:p>
+              <w:p>
+                <w:pPr>
+                  <w:jc w:val="both"/>
+                  <w:rPr>
+                    <w:i w:val="1"/>
+                    <w:sz w:val="18"/>
+                    <w:szCs w:val="18"/>
+                  </w:rPr>
+                </w:pPr>
+                <w:r>
+                  <w:rPr>
+                    <w:rtl w:val="0"/>
+                  </w:rPr>
+                </w:r>
+              </w:p>
+              <w:p>
+                <w:pPr>
+                  <w:jc w:val="both"/>
+                  <w:rPr>
+                    <w:i w:val="1"/>
+                    <w:sz w:val="18"/>
+                    <w:szCs w:val="18"/>
+                  </w:rPr>
+                </w:pPr>
+                <w:r>
+                  <w:rPr>
+                    <w:i w:val="1"/>
+                    <w:sz w:val="18"/>
+                    <w:szCs w:val="18"/>
+                    <w:rtl w:val="0"/>
+                  </w:rPr>
+                  <w:t xml:space="preserve">Documentación del stack tecnológico</w:t>
+                </w:r>
+              </w:p>
+              <w:p>
+                <w:pPr>
+                  <w:jc w:val="both"/>
+                  <w:rPr>
+                    <w:i w:val="1"/>
+                    <w:sz w:val="18"/>
+                    <w:szCs w:val="18"/>
+                  </w:rPr>
+                </w:pPr>
+                <w:r>
+                  <w:rPr>
+                    <w:rtl w:val="0"/>
+                  </w:rPr>
+                </w:r>
+              </w:p>
+              <w:p>
+                <w:pPr>
+                  <w:jc w:val="both"/>
+                  <w:rPr>
+                    <w:i w:val="1"/>
+                    <w:sz w:val="18"/>
+                    <w:szCs w:val="18"/>
+                  </w:rPr>
+                </w:pPr>
+                <w:r>
+                  <w:rPr>
+                    <w:i w:val="1"/>
+                    <w:sz w:val="18"/>
+                    <w:szCs w:val="18"/>
+                    <w:rtl w:val="0"/>
+                  </w:rPr>
+                  <w:t xml:space="preserve">Reuniones con el equipo para validar el diseño técnico</w:t>
+                </w:r>
+              </w:p>
+            </w:tc>
+            <w:tc>
+              <w:tcPr>
+                <w:tcBorders>
+                  <w:top w:color="bfbfbf" w:space="0" w:sz="4" w:val="single"/>
+                  <w:left w:color="bfbfbf" w:space="0" w:sz="4" w:val="single"/>
+                  <w:bottom w:color="bfbfbf" w:space="0" w:sz="4" w:val="single"/>
+                  <w:right w:color="bfbfbf" w:space="0" w:sz="4" w:val="single"/>
+                </w:tcBorders>
+              </w:tcPr>
+              <w:p>
+                <w:pPr>
+                  <w:jc w:val="both"/>
+                  <w:rPr>
+                    <w:i w:val="1"/>
+                    <w:sz w:val="18"/>
+                    <w:szCs w:val="18"/>
+                  </w:rPr>
+                </w:pPr>
+                <w:r>
+                  <w:rPr>
+                    <w:i w:val="1"/>
+                    <w:sz w:val="18"/>
+                    <w:szCs w:val="18"/>
+                    <w:rtl w:val="0"/>
+                  </w:rPr>
+                  <w:t xml:space="preserve">5 días hábiles</w:t>
+                </w:r>
+              </w:p>
+            </w:tc>
+            <w:tc>
+              <w:tcPr>
+                <w:tcBorders>
+                  <w:top w:color="bfbfbf" w:space="0" w:sz="4" w:val="single"/>
+                  <w:left w:color="bfbfbf" w:space="0" w:sz="4" w:val="single"/>
+                  <w:bottom w:color="bfbfbf" w:space="0" w:sz="4" w:val="single"/>
+                  <w:right w:color="bfbfbf" w:space="0" w:sz="4" w:val="single"/>
+                </w:tcBorders>
+              </w:tcPr>
+              <w:p>
+                <w:pPr>
+                  <w:jc w:val="both"/>
+                  <w:rPr>
+                    <w:i w:val="1"/>
+                    <w:sz w:val="18"/>
+                    <w:szCs w:val="18"/>
+                  </w:rPr>
+                </w:pPr>
+                <w:r>
+                  <w:rPr>
+                    <w:i w:val="1"/>
+                    <w:sz w:val="18"/>
+                    <w:szCs w:val="18"/>
+                    <w:rtl w:val="0"/>
+                  </w:rPr>
+                  <w:t xml:space="preserve">Matías González</w:t>
+                </w:r>
+              </w:p>
+            </w:tc>
+            <w:tc>
+              <w:tcPr>
+                <w:tcBorders>
+                  <w:top w:color="bfbfbf" w:space="0" w:sz="4" w:val="single"/>
+                  <w:left w:color="bfbfbf" w:space="0" w:sz="4" w:val="single"/>
+                  <w:bottom w:color="bfbfbf" w:space="0" w:sz="4" w:val="single"/>
+                  <w:right w:color="bfbfbf" w:space="0" w:sz="4" w:val="single"/>
+                </w:tcBorders>
+              </w:tcPr>
+              <w:p>
+                <w:pPr>
+                  <w:jc w:val="both"/>
+                  <w:rPr>
+                    <w:i w:val="1"/>
+                    <w:sz w:val="18"/>
+                    <w:szCs w:val="18"/>
+                  </w:rPr>
+                </w:pPr>
+                <w:r>
+                  <w:rPr>
+                    <w:i w:val="1"/>
+                    <w:sz w:val="18"/>
+                    <w:szCs w:val="18"/>
+                    <w:rtl w:val="0"/>
+                  </w:rPr>
+                  <w:t xml:space="preserve">La principal dificultad fue definir una estructura modular que mantuviera la escalabilidad futura del sistema. Como facilitador, se contó con una buena planificación y conocimiento del stack tecnológico, lo que permitió definir una arquitectura sólida.</w:t>
+                </w:r>
+              </w:p>
+            </w:tc>
+            <w:tc>
+              <w:tcPr>
+                <w:tcBorders>
+                  <w:top w:color="bfbfbf" w:space="0" w:sz="4" w:val="single"/>
+                  <w:left w:color="bfbfbf" w:space="0" w:sz="4" w:val="single"/>
+                  <w:bottom w:color="bfbfbf" w:space="0" w:sz="4" w:val="single"/>
+                  <w:right w:color="bfbfbf" w:space="0" w:sz="4" w:val="single"/>
+                </w:tcBorders>
+              </w:tcPr>
+              <w:p>
+                <w:pPr>
+                  <w:jc w:val="both"/>
+                  <w:rPr>
+                    <w:i w:val="1"/>
+                    <w:sz w:val="18"/>
+                    <w:szCs w:val="18"/>
+                  </w:rPr>
+                </w:pPr>
+                <w:r>
+                  <w:rPr>
+                    <w:i w:val="1"/>
+                    <w:sz w:val="18"/>
+                    <w:szCs w:val="18"/>
+                    <w:rtl w:val="0"/>
+                  </w:rPr>
+                  <w:t xml:space="preserve">Completado</w:t>
+                </w:r>
+              </w:p>
+            </w:tc>
+            <w:tc>
+              <w:tcPr>
+                <w:tcBorders>
+                  <w:top w:color="bfbfbf" w:space="0" w:sz="4" w:val="single"/>
+                  <w:left w:color="bfbfbf" w:space="0" w:sz="4" w:val="single"/>
+                  <w:bottom w:color="bfbfbf" w:space="0" w:sz="4" w:val="single"/>
+                  <w:right w:color="bfbfbf" w:space="0" w:sz="4" w:val="single"/>
+                </w:tcBorders>
+              </w:tcPr>
+              <w:p>
+                <w:pPr>
+                  <w:jc w:val="both"/>
+                  <w:rPr>
+                    <w:i w:val="1"/>
+                    <w:sz w:val="18"/>
+                    <w:szCs w:val="18"/>
+                  </w:rPr>
+                </w:pPr>
+                <w:r>
+                  <w:rPr>
+                    <w:i w:val="1"/>
+                    <w:sz w:val="18"/>
+                    <w:szCs w:val="18"/>
+                    <w:rtl w:val="0"/>
+                  </w:rPr>
+                  <w:t xml:space="preserve">Se incorporó la integración con servicios cloud (Supabase y Cloud Functions) para mejorar la escalabilidad y reducir la carga de mantenimiento.</w:t>
+                </w:r>
+              </w:p>
+            </w:tc>
+          </w:tr>
+          <w:tr>
+            <w:trPr>
+              <w:cantSplit w:val="0"/>
+              <w:trHeight w:val="440" w:hRule="atLeast"/>
+              <w:tblHeader w:val="0"/>
+            </w:trPr>
+            <w:tc>
+              <w:tcPr>
+                <w:tcBorders>
+                  <w:top w:color="bfbfbf" w:space="0" w:sz="4" w:val="single"/>
+                  <w:left w:color="bfbfbf" w:space="0" w:sz="4" w:val="single"/>
+                  <w:bottom w:color="bfbfbf" w:space="0" w:sz="4" w:val="single"/>
+                  <w:right w:color="bfbfbf" w:space="0" w:sz="4" w:val="single"/>
+                </w:tcBorders>
+              </w:tcPr>
+              <w:p>
+                <w:pPr>
+                  <w:jc w:val="both"/>
+                  <w:rPr>
+                    <w:sz w:val="18"/>
+                    <w:szCs w:val="18"/>
+                  </w:rPr>
+                </w:pPr>
+                <w:r>
+                  <w:rPr>
+                    <w:sz w:val="18"/>
+                    <w:szCs w:val="18"/>
+                    <w:rtl w:val="0"/>
+                  </w:rPr>
+                  <w:t xml:space="preserve">Construir programas y rutinas de variada complejidad para dar solución a requerimientos de la organización, acordes a tecnologías de mercado y utilizando buenas prácticas de codificación.</w:t>
+                </w:r>
+              </w:p>
+            </w:tc>
+            <w:tc>
+              <w:tcPr>
+                <w:tcBorders>
+                  <w:top w:color="bfbfbf" w:space="0" w:sz="4" w:val="single"/>
+                  <w:left w:color="bfbfbf" w:space="0" w:sz="4" w:val="single"/>
+                  <w:bottom w:color="bfbfbf" w:space="0" w:sz="4" w:val="single"/>
+                  <w:right w:color="bfbfbf" w:space="0" w:sz="4" w:val="single"/>
+                </w:tcBorders>
+              </w:tcPr>
+              <w:p>
+                <w:pPr>
+                  <w:jc w:val="both"/>
+                  <w:rPr>
+                    <w:i w:val="1"/>
+                    <w:sz w:val="18"/>
+                    <w:szCs w:val="18"/>
+                  </w:rPr>
+                </w:pPr>
+                <w:r>
+                  <w:rPr>
+                    <w:i w:val="1"/>
+                    <w:sz w:val="18"/>
+                    <w:szCs w:val="18"/>
+                    <w:rtl w:val="0"/>
+                  </w:rPr>
+                  <w:t xml:space="preserve">Implementar endpoint de registro</w:t>
+                </w:r>
+              </w:p>
+            </w:tc>
+            <w:tc>
+              <w:tcPr>
+                <w:tcBorders>
+                  <w:top w:color="bfbfbf" w:space="0" w:sz="4" w:val="single"/>
+                  <w:left w:color="bfbfbf" w:space="0" w:sz="4" w:val="single"/>
+                  <w:bottom w:color="bfbfbf" w:space="0" w:sz="4" w:val="single"/>
+                  <w:right w:color="bfbfbf" w:space="0" w:sz="4" w:val="single"/>
+                </w:tcBorders>
+              </w:tcPr>
+              <w:p>
+                <w:pPr>
+                  <w:jc w:val="both"/>
+                  <w:rPr>
+                    <w:i w:val="1"/>
+                    <w:sz w:val="18"/>
+                    <w:szCs w:val="18"/>
+                  </w:rPr>
+                </w:pPr>
+                <w:r>
+                  <w:rPr>
+                    <w:i w:val="1"/>
+                    <w:sz w:val="18"/>
+                    <w:szCs w:val="18"/>
+                    <w:rtl w:val="0"/>
+                  </w:rPr>
+                  <w:t xml:space="preserve">Entorno de desarrollo</w:t>
+                </w:r>
+              </w:p>
+              <w:p>
+                <w:pPr>
+                  <w:jc w:val="both"/>
+                  <w:rPr>
+                    <w:i w:val="1"/>
+                    <w:sz w:val="18"/>
+                    <w:szCs w:val="18"/>
+                  </w:rPr>
+                </w:pPr>
+                <w:r>
+                  <w:rPr>
+                    <w:i w:val="1"/>
+                    <w:sz w:val="18"/>
+                    <w:szCs w:val="18"/>
+                    <w:rtl w:val="0"/>
+                  </w:rPr>
+                  <w:t xml:space="preserve">Acceso a la base de datos</w:t>
+                </w:r>
+              </w:p>
+              <w:p>
+                <w:pPr>
+                  <w:jc w:val="both"/>
+                  <w:rPr>
+                    <w:i w:val="1"/>
+                    <w:sz w:val="18"/>
+                    <w:szCs w:val="18"/>
+                  </w:rPr>
+                </w:pPr>
+                <w:r>
+                  <w:rPr>
+                    <w:i w:val="1"/>
+                    <w:sz w:val="18"/>
+                    <w:szCs w:val="18"/>
+                    <w:rtl w:val="0"/>
+                  </w:rPr>
+                  <w:t xml:space="preserve">Documentación de API y librerías de autenticación</w:t>
+                </w:r>
+              </w:p>
+              <w:p>
+                <w:pPr>
+                  <w:jc w:val="both"/>
+                  <w:rPr>
+                    <w:i w:val="1"/>
+                    <w:sz w:val="18"/>
+                    <w:szCs w:val="18"/>
+                  </w:rPr>
+                </w:pPr>
+                <w:r>
+                  <w:rPr>
+                    <w:i w:val="1"/>
+                    <w:sz w:val="18"/>
+                    <w:szCs w:val="18"/>
+                    <w:rtl w:val="0"/>
+                  </w:rPr>
+                  <w:t xml:space="preserve">Conexión a internet</w:t>
+                </w:r>
+              </w:p>
+              <w:p>
+                <w:pPr>
+                  <w:jc w:val="both"/>
+                  <w:rPr>
+                    <w:i w:val="1"/>
+                    <w:sz w:val="18"/>
+                    <w:szCs w:val="18"/>
+                  </w:rPr>
+                </w:pPr>
+                <w:r>
+                  <w:rPr>
+                    <w:rtl w:val="0"/>
+                  </w:rPr>
+                </w:r>
+              </w:p>
+            </w:tc>
+            <w:tc>
+              <w:tcPr>
+                <w:tcBorders>
+                  <w:top w:color="bfbfbf" w:space="0" w:sz="4" w:val="single"/>
+                  <w:left w:color="bfbfbf" w:space="0" w:sz="4" w:val="single"/>
+                  <w:bottom w:color="bfbfbf" w:space="0" w:sz="4" w:val="single"/>
+                  <w:right w:color="bfbfbf" w:space="0" w:sz="4" w:val="single"/>
+                </w:tcBorders>
+              </w:tcPr>
+              <w:p>
+                <w:pPr>
+                  <w:jc w:val="both"/>
+                  <w:rPr>
+                    <w:i w:val="1"/>
+                    <w:sz w:val="18"/>
+                    <w:szCs w:val="18"/>
+                  </w:rPr>
+                </w:pPr>
+                <w:r>
+                  <w:rPr>
+                    <w:i w:val="1"/>
+                    <w:sz w:val="18"/>
+                    <w:szCs w:val="18"/>
+                    <w:rtl w:val="0"/>
+                  </w:rPr>
+                  <w:t xml:space="preserve">5 días hábiles</w:t>
+                </w:r>
+              </w:p>
+            </w:tc>
+            <w:tc>
+              <w:tcPr>
+                <w:tcBorders>
+                  <w:top w:color="bfbfbf" w:space="0" w:sz="4" w:val="single"/>
+                  <w:left w:color="bfbfbf" w:space="0" w:sz="4" w:val="single"/>
+                  <w:bottom w:color="bfbfbf" w:space="0" w:sz="4" w:val="single"/>
+                  <w:right w:color="bfbfbf" w:space="0" w:sz="4" w:val="single"/>
+                </w:tcBorders>
+              </w:tcPr>
+              <w:p>
+                <w:pPr>
+                  <w:jc w:val="both"/>
+                  <w:rPr>
+                    <w:i w:val="1"/>
+                    <w:sz w:val="18"/>
+                    <w:szCs w:val="18"/>
+                  </w:rPr>
+                </w:pPr>
+                <w:r>
+                  <w:rPr>
+                    <w:i w:val="1"/>
+                    <w:sz w:val="18"/>
+                    <w:szCs w:val="18"/>
+                    <w:rtl w:val="0"/>
+                  </w:rPr>
+                  <w:t xml:space="preserve">Brayan Gatica</w:t>
+                </w:r>
+              </w:p>
+            </w:tc>
+            <w:tc>
+              <w:tcPr>
+                <w:tcBorders>
+                  <w:top w:color="bfbfbf" w:space="0" w:sz="4" w:val="single"/>
+                  <w:left w:color="bfbfbf" w:space="0" w:sz="4" w:val="single"/>
+                  <w:bottom w:color="bfbfbf" w:space="0" w:sz="4" w:val="single"/>
+                  <w:right w:color="bfbfbf" w:space="0" w:sz="4" w:val="single"/>
+                </w:tcBorders>
+              </w:tcPr>
+              <w:p>
+                <w:pPr>
+                  <w:jc w:val="both"/>
+                  <w:rPr>
+                    <w:i w:val="1"/>
+                    <w:sz w:val="18"/>
+                    <w:szCs w:val="18"/>
+                  </w:rPr>
+                </w:pPr>
+                <w:r>
+                  <w:rPr>
+                    <w:i w:val="1"/>
+                    <w:sz w:val="18"/>
+                    <w:szCs w:val="18"/>
+                    <w:rtl w:val="0"/>
+                  </w:rPr>
+                  <w:t xml:space="preserve">Una posible dificultad puede ser la configuración inicial de la conexión con la base de datos o la implementación de medidas de seguridad. Como facilitador, el equipo ya cuenta con experiencia previa en autenticación y buenas prácticas de desarrollo backend.</w:t>
+                </w:r>
+              </w:p>
+            </w:tc>
+            <w:tc>
+              <w:tcPr>
+                <w:tcBorders>
+                  <w:top w:color="bfbfbf" w:space="0" w:sz="4" w:val="single"/>
+                  <w:left w:color="bfbfbf" w:space="0" w:sz="4" w:val="single"/>
+                  <w:bottom w:color="bfbfbf" w:space="0" w:sz="4" w:val="single"/>
+                  <w:right w:color="bfbfbf" w:space="0" w:sz="4" w:val="single"/>
+                </w:tcBorders>
+              </w:tcPr>
+              <w:p>
+                <w:pPr>
+                  <w:jc w:val="both"/>
+                  <w:rPr>
+                    <w:i w:val="1"/>
+                    <w:sz w:val="18"/>
+                    <w:szCs w:val="18"/>
+                  </w:rPr>
+                </w:pPr>
+                <w:r>
+                  <w:rPr>
+                    <w:i w:val="1"/>
+                    <w:sz w:val="18"/>
+                    <w:szCs w:val="18"/>
+                    <w:rtl w:val="0"/>
+                  </w:rPr>
+                  <w:t xml:space="preserve">Completado</w:t>
+                </w:r>
+              </w:p>
+            </w:tc>
+            <w:tc>
+              <w:tcPr>
+                <w:tcBorders>
+                  <w:top w:color="bfbfbf" w:space="0" w:sz="4" w:val="single"/>
+                  <w:left w:color="bfbfbf" w:space="0" w:sz="4" w:val="single"/>
+                  <w:bottom w:color="bfbfbf" w:space="0" w:sz="4" w:val="single"/>
+                  <w:right w:color="bfbfbf" w:space="0" w:sz="4" w:val="single"/>
+                </w:tcBorders>
+              </w:tcPr>
+              <w:p>
+                <w:pPr>
+                  <w:jc w:val="both"/>
+                  <w:rPr>
+                    <w:i w:val="1"/>
+                    <w:sz w:val="18"/>
+                    <w:szCs w:val="18"/>
+                  </w:rPr>
+                </w:pPr>
+                <w:r>
+                  <w:rPr>
+                    <w:i w:val="1"/>
+                    <w:sz w:val="18"/>
+                    <w:szCs w:val="18"/>
+                    <w:rtl w:val="0"/>
+                  </w:rPr>
+                  <w:t xml:space="preserve">Se optimizó la estructura de validación de datos para mejorar el manejo de errores y se implementaron mensajes de respuesta más claros en el endpoint.</w:t>
+                </w:r>
+              </w:p>
+            </w:tc>
+          </w:tr>
+          <w:tr>
+            <w:trPr>
+              <w:cantSplit w:val="0"/>
+              <w:trHeight w:val="440" w:hRule="atLeast"/>
+              <w:tblHeader w:val="0"/>
+            </w:trPr>
+            <w:tc>
+              <w:tcPr>
+                <w:tcBorders>
+                  <w:top w:color="bfbfbf" w:space="0" w:sz="4" w:val="single"/>
+                  <w:left w:color="bfbfbf" w:space="0" w:sz="4" w:val="single"/>
+                  <w:bottom w:color="bfbfbf" w:space="0" w:sz="4" w:val="single"/>
+                  <w:right w:color="bfbfbf" w:space="0" w:sz="4" w:val="single"/>
+                </w:tcBorders>
+              </w:tcPr>
+              <w:p>
+                <w:pPr>
+                  <w:jc w:val="both"/>
+                  <w:rPr>
+                    <w:sz w:val="18"/>
+                    <w:szCs w:val="18"/>
+                  </w:rPr>
+                </w:pPr>
+                <w:r>
+                  <w:rPr>
+                    <w:sz w:val="18"/>
+                    <w:szCs w:val="18"/>
+                    <w:rtl w:val="0"/>
+                  </w:rPr>
+                  <w:t xml:space="preserve">Implementar soluciones sistémicas integrales para automatizar u optimizar procesos de negocio de acuerdo a las necesidades de la organización.</w:t>
+                </w:r>
+              </w:p>
+            </w:tc>
+            <w:tc>
+              <w:tcPr>
+                <w:tcBorders>
+                  <w:top w:color="bfbfbf" w:space="0" w:sz="4" w:val="single"/>
+                  <w:left w:color="bfbfbf" w:space="0" w:sz="4" w:val="single"/>
+                  <w:bottom w:color="bfbfbf" w:space="0" w:sz="4" w:val="single"/>
+                  <w:right w:color="bfbfbf" w:space="0" w:sz="4" w:val="single"/>
+                </w:tcBorders>
+              </w:tcPr>
+              <w:p>
+                <w:pPr>
+                  <w:jc w:val="both"/>
+                  <w:rPr>
+                    <w:i w:val="1"/>
+                    <w:sz w:val="18"/>
+                    <w:szCs w:val="18"/>
+                  </w:rPr>
+                </w:pPr>
+                <w:r>
+                  <w:rPr>
+                    <w:i w:val="1"/>
+                    <w:sz w:val="18"/>
+                    <w:szCs w:val="18"/>
+                    <w:rtl w:val="0"/>
+                  </w:rPr>
+                  <w:t xml:space="preserve">Implementar onboarding con selección de sueldo</w:t>
+                </w:r>
+              </w:p>
+            </w:tc>
+            <w:tc>
+              <w:tcPr>
+                <w:tcBorders>
+                  <w:top w:color="bfbfbf" w:space="0" w:sz="4" w:val="single"/>
+                  <w:left w:color="bfbfbf" w:space="0" w:sz="4" w:val="single"/>
+                  <w:bottom w:color="bfbfbf" w:space="0" w:sz="4" w:val="single"/>
+                  <w:right w:color="bfbfbf" w:space="0" w:sz="4" w:val="single"/>
+                </w:tcBorders>
+              </w:tcPr>
+              <w:p>
+                <w:pPr>
+                  <w:jc w:val="both"/>
+                  <w:rPr>
+                    <w:i w:val="1"/>
+                    <w:sz w:val="18"/>
+                    <w:szCs w:val="18"/>
+                  </w:rPr>
+                </w:pPr>
+                <w:r>
+                  <w:rPr>
+                    <w:i w:val="1"/>
+                    <w:sz w:val="18"/>
+                    <w:szCs w:val="18"/>
+                    <w:rtl w:val="0"/>
+                  </w:rPr>
+                  <w:t xml:space="preserve">Figma </w:t>
+                </w:r>
+              </w:p>
+              <w:p>
+                <w:pPr>
+                  <w:jc w:val="both"/>
+                  <w:rPr>
+                    <w:i w:val="1"/>
+                    <w:sz w:val="18"/>
+                    <w:szCs w:val="18"/>
+                  </w:rPr>
+                </w:pPr>
+                <w:r>
+                  <w:rPr>
+                    <w:i w:val="1"/>
+                    <w:sz w:val="18"/>
+                    <w:szCs w:val="18"/>
+                    <w:rtl w:val="0"/>
+                  </w:rPr>
+                  <w:t xml:space="preserve">Framework frontend </w:t>
+                </w:r>
+              </w:p>
+              <w:p>
+                <w:pPr>
+                  <w:jc w:val="both"/>
+                  <w:rPr>
+                    <w:i w:val="1"/>
+                    <w:sz w:val="18"/>
+                    <w:szCs w:val="18"/>
+                  </w:rPr>
+                </w:pPr>
+                <w:r>
+                  <w:rPr>
+                    <w:i w:val="1"/>
+                    <w:sz w:val="18"/>
+                    <w:szCs w:val="18"/>
+                    <w:rtl w:val="0"/>
+                  </w:rPr>
+                  <w:t xml:space="preserve">Conexión a la API para guardar los datos del usuario</w:t>
+                </w:r>
+              </w:p>
+              <w:p>
+                <w:pPr>
+                  <w:jc w:val="both"/>
+                  <w:rPr>
+                    <w:i w:val="1"/>
+                    <w:sz w:val="18"/>
+                    <w:szCs w:val="18"/>
+                  </w:rPr>
+                </w:pPr>
+                <w:r>
+                  <w:rPr>
+                    <w:i w:val="1"/>
+                    <w:sz w:val="18"/>
+                    <w:szCs w:val="18"/>
+                    <w:rtl w:val="0"/>
+                  </w:rPr>
+                  <w:t xml:space="preserve">Supabase para persistencia de información</w:t>
+                </w:r>
+              </w:p>
+              <w:p>
+                <w:pPr>
+                  <w:jc w:val="both"/>
+                  <w:rPr>
+                    <w:i w:val="1"/>
+                    <w:sz w:val="18"/>
+                    <w:szCs w:val="18"/>
+                  </w:rPr>
+                </w:pPr>
+                <w:r>
+                  <w:rPr>
+                    <w:rtl w:val="0"/>
+                  </w:rPr>
+                </w:r>
+              </w:p>
+            </w:tc>
+            <w:tc>
+              <w:tcPr>
+                <w:tcBorders>
+                  <w:top w:color="bfbfbf" w:space="0" w:sz="4" w:val="single"/>
+                  <w:left w:color="bfbfbf" w:space="0" w:sz="4" w:val="single"/>
+                  <w:bottom w:color="bfbfbf" w:space="0" w:sz="4" w:val="single"/>
+                  <w:right w:color="bfbfbf" w:space="0" w:sz="4" w:val="single"/>
+                </w:tcBorders>
+              </w:tcPr>
+              <w:p>
+                <w:pPr>
+                  <w:jc w:val="both"/>
+                  <w:rPr>
+                    <w:i w:val="1"/>
+                    <w:sz w:val="18"/>
+                    <w:szCs w:val="18"/>
+                  </w:rPr>
+                </w:pPr>
+                <w:r>
+                  <w:rPr>
+                    <w:i w:val="1"/>
+                    <w:sz w:val="18"/>
+                    <w:szCs w:val="18"/>
+                    <w:rtl w:val="0"/>
+                  </w:rPr>
+                  <w:t xml:space="preserve">6 días hábiles</w:t>
+                </w:r>
+              </w:p>
+            </w:tc>
+            <w:tc>
+              <w:tcPr>
+                <w:tcBorders>
+                  <w:top w:color="bfbfbf" w:space="0" w:sz="4" w:val="single"/>
+                  <w:left w:color="bfbfbf" w:space="0" w:sz="4" w:val="single"/>
+                  <w:bottom w:color="bfbfbf" w:space="0" w:sz="4" w:val="single"/>
+                  <w:right w:color="bfbfbf" w:space="0" w:sz="4" w:val="single"/>
+                </w:tcBorders>
+              </w:tcPr>
+              <w:p>
+                <w:pPr>
+                  <w:jc w:val="both"/>
+                  <w:rPr>
+                    <w:i w:val="1"/>
+                    <w:sz w:val="18"/>
+                    <w:szCs w:val="18"/>
+                  </w:rPr>
+                </w:pPr>
+                <w:r>
+                  <w:rPr>
+                    <w:i w:val="1"/>
+                    <w:sz w:val="18"/>
+                    <w:szCs w:val="18"/>
+                    <w:rtl w:val="0"/>
+                  </w:rPr>
+                  <w:t xml:space="preserve">Felipe Valdebenito</w:t>
+                </w:r>
+              </w:p>
+            </w:tc>
+            <w:tc>
+              <w:tcPr>
+                <w:tcBorders>
+                  <w:top w:color="bfbfbf" w:space="0" w:sz="4" w:val="single"/>
+                  <w:left w:color="bfbfbf" w:space="0" w:sz="4" w:val="single"/>
+                  <w:bottom w:color="bfbfbf" w:space="0" w:sz="4" w:val="single"/>
+                  <w:right w:color="bfbfbf" w:space="0" w:sz="4" w:val="single"/>
+                </w:tcBorders>
+              </w:tcPr>
+              <w:p>
+                <w:pPr>
+                  <w:jc w:val="both"/>
+                  <w:rPr>
+                    <w:i w:val="1"/>
+                    <w:sz w:val="18"/>
+                    <w:szCs w:val="18"/>
+                  </w:rPr>
+                </w:pPr>
+                <w:r>
+                  <w:rPr>
+                    <w:i w:val="1"/>
+                    <w:sz w:val="18"/>
+                    <w:szCs w:val="18"/>
+                    <w:rtl w:val="0"/>
+                  </w:rPr>
+                  <w:t xml:space="preserve">Una dificultad menor podría ser la correcta integración del frontend con el backend y la base de datos. Como facilitador, la comunicación fluida del equipo y el diseño claro del flujo en Figma ayudan a acelerar la implementación.</w:t>
+                </w:r>
+              </w:p>
+            </w:tc>
+            <w:tc>
+              <w:tcPr>
+                <w:tcBorders>
+                  <w:top w:color="bfbfbf" w:space="0" w:sz="4" w:val="single"/>
+                  <w:left w:color="bfbfbf" w:space="0" w:sz="4" w:val="single"/>
+                  <w:bottom w:color="bfbfbf" w:space="0" w:sz="4" w:val="single"/>
+                  <w:right w:color="bfbfbf" w:space="0" w:sz="4" w:val="single"/>
+                </w:tcBorders>
+              </w:tcPr>
+              <w:p>
+                <w:pPr>
+                  <w:jc w:val="both"/>
+                  <w:rPr>
+                    <w:i w:val="1"/>
+                    <w:sz w:val="18"/>
+                    <w:szCs w:val="18"/>
+                  </w:rPr>
+                </w:pPr>
+                <w:r>
+                  <w:rPr>
+                    <w:i w:val="1"/>
+                    <w:sz w:val="18"/>
+                    <w:szCs w:val="18"/>
+                    <w:rtl w:val="0"/>
+                  </w:rPr>
+                  <w:t xml:space="preserve">En curso</w:t>
+                </w:r>
+              </w:p>
+            </w:tc>
+            <w:tc>
+              <w:tcPr>
+                <w:tcBorders>
+                  <w:top w:color="bfbfbf" w:space="0" w:sz="4" w:val="single"/>
+                  <w:left w:color="bfbfbf" w:space="0" w:sz="4" w:val="single"/>
+                  <w:bottom w:color="bfbfbf" w:space="0" w:sz="4" w:val="single"/>
+                  <w:right w:color="bfbfbf" w:space="0" w:sz="4" w:val="single"/>
+                </w:tcBorders>
+              </w:tcPr>
+              <w:p>
+                <w:pPr>
+                  <w:jc w:val="both"/>
+                  <w:rPr>
+                    <w:i w:val="1"/>
+                    <w:sz w:val="18"/>
+                    <w:szCs w:val="18"/>
+                  </w:rPr>
+                </w:pPr>
+                <w:r>
+                  <w:rPr>
+                    <w:i w:val="1"/>
+                    <w:sz w:val="18"/>
+                    <w:szCs w:val="18"/>
+                    <w:rtl w:val="0"/>
+                  </w:rPr>
+                  <w:t xml:space="preserve">Se realizaron pequeñas modificaciones al diseño del flujo de onboarding para mejorar la usabilidad y alinearlo con los requerimientos funcionales del proyecto.</w:t>
+                </w:r>
+              </w:p>
+            </w:tc>
+          </w:tr>
+          <w:tr>
+            <w:trPr>
+              <w:cantSplit w:val="0"/>
+              <w:trHeight w:val="440" w:hRule="atLeast"/>
+              <w:tblHeader w:val="0"/>
+            </w:trPr>
+            <w:tc>
+              <w:tcPr>
+                <w:tcBorders>
+                  <w:top w:color="bfbfbf" w:space="0" w:sz="4" w:val="single"/>
+                  <w:left w:color="bfbfbf" w:space="0" w:sz="4" w:val="single"/>
+                  <w:bottom w:color="bfbfbf" w:space="0" w:sz="4" w:val="single"/>
+                  <w:right w:color="bfbfbf" w:space="0" w:sz="4" w:val="single"/>
+                </w:tcBorders>
+              </w:tcPr>
+              <w:p>
+                <w:pPr>
+                  <w:jc w:val="both"/>
+                  <w:rPr>
+                    <w:sz w:val="18"/>
+                    <w:szCs w:val="18"/>
+                  </w:rPr>
+                </w:pPr>
+                <w:r>
+                  <w:rPr>
+                    <w:sz w:val="18"/>
+                    <w:szCs w:val="18"/>
+                    <w:rtl w:val="0"/>
+                  </w:rPr>
+                  <w:t xml:space="preserve">Construir programas y rutinas de variada complejidad para dar solución a requerimientos de la organización, acordes a tecnologías de mercado y utilizando buenas prácticas de codificación.</w:t>
+                </w:r>
+              </w:p>
+            </w:tc>
+            <w:tc>
+              <w:tcPr>
+                <w:tcBorders>
+                  <w:top w:color="bfbfbf" w:space="0" w:sz="4" w:val="single"/>
+                  <w:left w:color="bfbfbf" w:space="0" w:sz="4" w:val="single"/>
+                  <w:bottom w:color="bfbfbf" w:space="0" w:sz="4" w:val="single"/>
+                  <w:right w:color="bfbfbf" w:space="0" w:sz="4" w:val="single"/>
+                </w:tcBorders>
+              </w:tcPr>
+              <w:p>
+                <w:pPr>
+                  <w:jc w:val="both"/>
+                  <w:rPr>
+                    <w:i w:val="1"/>
+                    <w:sz w:val="18"/>
+                    <w:szCs w:val="18"/>
+                  </w:rPr>
+                </w:pPr>
+                <w:r>
+                  <w:rPr>
+                    <w:i w:val="1"/>
+                    <w:sz w:val="18"/>
+                    <w:szCs w:val="18"/>
+                    <w:rtl w:val="0"/>
+                  </w:rPr>
+                  <w:t xml:space="preserve">Implementar creación de gasto manual</w:t>
+                </w:r>
+              </w:p>
+            </w:tc>
+            <w:tc>
+              <w:tcPr>
+                <w:tcBorders>
+                  <w:top w:color="bfbfbf" w:space="0" w:sz="4" w:val="single"/>
+                  <w:left w:color="bfbfbf" w:space="0" w:sz="4" w:val="single"/>
+                  <w:bottom w:color="bfbfbf" w:space="0" w:sz="4" w:val="single"/>
+                  <w:right w:color="bfbfbf" w:space="0" w:sz="4" w:val="single"/>
+                </w:tcBorders>
+              </w:tcPr>
+              <w:p>
+                <w:pPr>
+                  <w:jc w:val="both"/>
+                  <w:rPr>
+                    <w:i w:val="1"/>
+                    <w:sz w:val="18"/>
+                    <w:szCs w:val="18"/>
+                  </w:rPr>
+                </w:pPr>
+                <w:r>
+                  <w:rPr>
+                    <w:i w:val="1"/>
+                    <w:sz w:val="18"/>
+                    <w:szCs w:val="18"/>
+                    <w:rtl w:val="0"/>
+                  </w:rPr>
+                  <w:t xml:space="preserve">Entorno de desarrollo (Visual Studio Code, repositorio Git)</w:t>
+                </w:r>
+              </w:p>
+              <w:p>
+                <w:pPr>
+                  <w:jc w:val="both"/>
+                  <w:rPr>
+                    <w:i w:val="1"/>
+                    <w:sz w:val="18"/>
+                    <w:szCs w:val="18"/>
+                  </w:rPr>
+                </w:pPr>
+                <w:r>
+                  <w:rPr>
+                    <w:i w:val="1"/>
+                    <w:sz w:val="18"/>
+                    <w:szCs w:val="18"/>
+                    <w:rtl w:val="0"/>
+                  </w:rPr>
+                  <w:t xml:space="preserve">Base de datos de prueba</w:t>
+                </w:r>
+              </w:p>
+              <w:p>
+                <w:pPr>
+                  <w:jc w:val="both"/>
+                  <w:rPr>
+                    <w:i w:val="1"/>
+                    <w:sz w:val="18"/>
+                    <w:szCs w:val="18"/>
+                  </w:rPr>
+                </w:pPr>
+                <w:r>
+                  <w:rPr>
+                    <w:rtl w:val="0"/>
+                  </w:rPr>
+                </w:r>
+              </w:p>
+              <w:p>
+                <w:pPr>
+                  <w:jc w:val="both"/>
+                  <w:rPr>
+                    <w:i w:val="1"/>
+                    <w:sz w:val="18"/>
+                    <w:szCs w:val="18"/>
+                  </w:rPr>
+                </w:pPr>
+                <w:r>
+                  <w:rPr>
+                    <w:i w:val="1"/>
+                    <w:sz w:val="18"/>
+                    <w:szCs w:val="18"/>
+                    <w:rtl w:val="0"/>
+                  </w:rPr>
+                  <w:t xml:space="preserve">Librerías y frameworks definidos por el proyecto</w:t>
+                </w:r>
+              </w:p>
+            </w:tc>
+            <w:tc>
+              <w:tcPr>
+                <w:tcBorders>
+                  <w:top w:color="bfbfbf" w:space="0" w:sz="4" w:val="single"/>
+                  <w:left w:color="bfbfbf" w:space="0" w:sz="4" w:val="single"/>
+                  <w:bottom w:color="bfbfbf" w:space="0" w:sz="4" w:val="single"/>
+                  <w:right w:color="bfbfbf" w:space="0" w:sz="4" w:val="single"/>
+                </w:tcBorders>
+              </w:tcPr>
+              <w:p>
+                <w:pPr>
+                  <w:jc w:val="both"/>
+                  <w:rPr>
+                    <w:i w:val="1"/>
+                    <w:sz w:val="18"/>
+                    <w:szCs w:val="18"/>
+                  </w:rPr>
+                </w:pPr>
+                <w:r>
+                  <w:rPr>
+                    <w:i w:val="1"/>
+                    <w:sz w:val="18"/>
+                    <w:szCs w:val="18"/>
+                    <w:rtl w:val="0"/>
+                  </w:rPr>
+                  <w:t xml:space="preserve">5 días hábiles.</w:t>
+                </w:r>
+              </w:p>
+            </w:tc>
+            <w:tc>
+              <w:tcPr>
+                <w:tcBorders>
+                  <w:top w:color="bfbfbf" w:space="0" w:sz="4" w:val="single"/>
+                  <w:left w:color="bfbfbf" w:space="0" w:sz="4" w:val="single"/>
+                  <w:bottom w:color="bfbfbf" w:space="0" w:sz="4" w:val="single"/>
+                  <w:right w:color="bfbfbf" w:space="0" w:sz="4" w:val="single"/>
+                </w:tcBorders>
+              </w:tcPr>
+              <w:p>
+                <w:pPr>
+                  <w:jc w:val="both"/>
+                  <w:rPr>
+                    <w:i w:val="1"/>
+                    <w:sz w:val="18"/>
+                    <w:szCs w:val="18"/>
+                  </w:rPr>
+                </w:pPr>
+                <w:r>
+                  <w:rPr>
+                    <w:i w:val="1"/>
+                    <w:sz w:val="18"/>
+                    <w:szCs w:val="18"/>
+                    <w:rtl w:val="0"/>
+                  </w:rPr>
+                  <w:t xml:space="preserve">Matías Gonzáñez</w:t>
+                </w:r>
+              </w:p>
+            </w:tc>
+            <w:tc>
+              <w:tcPr>
+                <w:tcBorders>
+                  <w:top w:color="bfbfbf" w:space="0" w:sz="4" w:val="single"/>
+                  <w:left w:color="bfbfbf" w:space="0" w:sz="4" w:val="single"/>
+                  <w:bottom w:color="bfbfbf" w:space="0" w:sz="4" w:val="single"/>
+                  <w:right w:color="bfbfbf" w:space="0" w:sz="4" w:val="single"/>
+                </w:tcBorders>
+              </w:tcPr>
+              <w:p>
+                <w:pPr>
+                  <w:jc w:val="both"/>
+                  <w:rPr>
+                    <w:i w:val="1"/>
+                    <w:sz w:val="18"/>
+                    <w:szCs w:val="18"/>
+                  </w:rPr>
+                </w:pPr>
+                <w:r>
+                  <w:rPr>
+                    <w:i w:val="1"/>
+                    <w:sz w:val="18"/>
+                    <w:szCs w:val="18"/>
+                    <w:rtl w:val="0"/>
+                  </w:rPr>
+                  <w:t xml:space="preserve">Se logró implementar la creación de gastos manuales integrando la lógica de negocio y validaciones necesarias.</w:t>
+                </w:r>
+              </w:p>
+            </w:tc>
+            <w:tc>
+              <w:tcPr>
+                <w:tcBorders>
+                  <w:top w:color="bfbfbf" w:space="0" w:sz="4" w:val="single"/>
+                  <w:left w:color="bfbfbf" w:space="0" w:sz="4" w:val="single"/>
+                  <w:bottom w:color="bfbfbf" w:space="0" w:sz="4" w:val="single"/>
+                  <w:right w:color="bfbfbf" w:space="0" w:sz="4" w:val="single"/>
+                </w:tcBorders>
+              </w:tcPr>
+              <w:p>
+                <w:pPr>
+                  <w:jc w:val="both"/>
+                  <w:rPr>
+                    <w:i w:val="1"/>
+                    <w:sz w:val="18"/>
+                    <w:szCs w:val="18"/>
+                  </w:rPr>
+                </w:pPr>
+                <w:r>
+                  <w:rPr>
+                    <w:i w:val="1"/>
+                    <w:sz w:val="18"/>
+                    <w:szCs w:val="18"/>
+                    <w:rtl w:val="0"/>
+                  </w:rPr>
+                  <w:t xml:space="preserve">Completado</w:t>
+                </w:r>
+              </w:p>
+            </w:tc>
+            <w:tc>
+              <w:tcPr>
+                <w:tcBorders>
+                  <w:top w:color="bfbfbf" w:space="0" w:sz="4" w:val="single"/>
+                  <w:left w:color="bfbfbf" w:space="0" w:sz="4" w:val="single"/>
+                  <w:bottom w:color="bfbfbf" w:space="0" w:sz="4" w:val="single"/>
+                  <w:right w:color="bfbfbf" w:space="0" w:sz="4" w:val="single"/>
+                </w:tcBorders>
+              </w:tcPr>
+              <w:p>
+                <w:pPr>
+                  <w:jc w:val="both"/>
+                  <w:rPr>
+                    <w:i w:val="1"/>
+                    <w:sz w:val="18"/>
+                    <w:szCs w:val="18"/>
+                  </w:rPr>
+                </w:pPr>
+                <w:r>
+                  <w:rPr>
+                    <w:i w:val="1"/>
+                    <w:sz w:val="18"/>
+                    <w:szCs w:val="18"/>
+                    <w:rtl w:val="0"/>
+                  </w:rPr>
+                  <w:t xml:space="preserve">Se ajustó la validación de datos y se mejoró la estructura del endpoint para asegurar una correcta persistencia de los registros.</w:t>
+                </w:r>
+              </w:p>
+            </w:tc>
+          </w:tr>
+          <w:tr>
+            <w:trPr>
+              <w:cantSplit w:val="0"/>
+              <w:trHeight w:val="440" w:hRule="atLeast"/>
+              <w:tblHeader w:val="0"/>
+            </w:trPr>
+            <w:tc>
+              <w:tcPr>
+                <w:tcBorders>
+                  <w:top w:color="bfbfbf" w:space="0" w:sz="4" w:val="single"/>
+                  <w:left w:color="bfbfbf" w:space="0" w:sz="4" w:val="single"/>
+                  <w:bottom w:color="bfbfbf" w:space="0" w:sz="4" w:val="single"/>
+                  <w:right w:color="bfbfbf" w:space="0" w:sz="4" w:val="single"/>
+                </w:tcBorders>
+              </w:tcPr>
+              <w:p>
+                <w:pPr>
+                  <w:jc w:val="both"/>
+                  <w:rPr>
+                    <w:sz w:val="18"/>
+                    <w:szCs w:val="18"/>
+                  </w:rPr>
+                </w:pPr>
+                <w:r>
+                  <w:rPr>
+                    <w:sz w:val="18"/>
+                    <w:szCs w:val="18"/>
+                    <w:rtl w:val="0"/>
+                  </w:rPr>
+                  <w:t xml:space="preserve">Realizar pruebas de certificación tanto de los productos como de los procesos utilizando buenas prácticas definidas por la industria.</w:t>
+                </w:r>
+              </w:p>
+            </w:tc>
+            <w:tc>
+              <w:tcPr>
+                <w:tcBorders>
+                  <w:top w:color="bfbfbf" w:space="0" w:sz="4" w:val="single"/>
+                  <w:left w:color="bfbfbf" w:space="0" w:sz="4" w:val="single"/>
+                  <w:bottom w:color="bfbfbf" w:space="0" w:sz="4" w:val="single"/>
+                  <w:right w:color="bfbfbf" w:space="0" w:sz="4" w:val="single"/>
+                </w:tcBorders>
+              </w:tcPr>
+              <w:p>
+                <w:pPr>
+                  <w:jc w:val="both"/>
+                  <w:rPr>
+                    <w:i w:val="1"/>
+                    <w:sz w:val="18"/>
+                    <w:szCs w:val="18"/>
+                  </w:rPr>
+                </w:pPr>
+                <w:r>
+                  <w:rPr>
+                    <w:i w:val="1"/>
+                    <w:sz w:val="18"/>
+                    <w:szCs w:val="18"/>
+                    <w:rtl w:val="0"/>
+                  </w:rPr>
+                  <w:t xml:space="preserve">Unit testing de creación</w:t>
+                </w:r>
+              </w:p>
+            </w:tc>
+            <w:tc>
+              <w:tcPr>
+                <w:tcBorders>
+                  <w:top w:color="bfbfbf" w:space="0" w:sz="4" w:val="single"/>
+                  <w:left w:color="bfbfbf" w:space="0" w:sz="4" w:val="single"/>
+                  <w:bottom w:color="bfbfbf" w:space="0" w:sz="4" w:val="single"/>
+                  <w:right w:color="bfbfbf" w:space="0" w:sz="4" w:val="single"/>
+                </w:tcBorders>
+              </w:tcPr>
+              <w:p>
+                <w:pPr>
+                  <w:jc w:val="both"/>
+                  <w:rPr>
+                    <w:i w:val="1"/>
+                    <w:sz w:val="18"/>
+                    <w:szCs w:val="18"/>
+                  </w:rPr>
+                </w:pPr>
+                <w:r>
+                  <w:rPr>
+                    <w:i w:val="1"/>
+                    <w:sz w:val="18"/>
+                    <w:szCs w:val="18"/>
+                    <w:rtl w:val="0"/>
+                  </w:rPr>
+                  <w:t xml:space="preserve">Código fuente del módulo de creación</w:t>
+                </w:r>
+              </w:p>
+              <w:p>
+                <w:pPr>
+                  <w:jc w:val="both"/>
+                  <w:rPr>
+                    <w:i w:val="1"/>
+                    <w:sz w:val="18"/>
+                    <w:szCs w:val="18"/>
+                  </w:rPr>
+                </w:pPr>
+                <w:r>
+                  <w:rPr>
+                    <w:rtl w:val="0"/>
+                  </w:rPr>
+                </w:r>
+              </w:p>
+              <w:p>
+                <w:pPr>
+                  <w:jc w:val="both"/>
+                  <w:rPr>
+                    <w:i w:val="1"/>
+                    <w:sz w:val="18"/>
+                    <w:szCs w:val="18"/>
+                  </w:rPr>
+                </w:pPr>
+                <w:r>
+                  <w:rPr>
+                    <w:i w:val="1"/>
+                    <w:sz w:val="18"/>
+                    <w:szCs w:val="18"/>
+                    <w:rtl w:val="0"/>
+                  </w:rPr>
+                  <w:t xml:space="preserve">Documentación de requerimientos</w:t>
+                </w:r>
+              </w:p>
+            </w:tc>
+            <w:tc>
+              <w:tcPr>
+                <w:tcBorders>
+                  <w:top w:color="bfbfbf" w:space="0" w:sz="4" w:val="single"/>
+                  <w:left w:color="bfbfbf" w:space="0" w:sz="4" w:val="single"/>
+                  <w:bottom w:color="bfbfbf" w:space="0" w:sz="4" w:val="single"/>
+                  <w:right w:color="bfbfbf" w:space="0" w:sz="4" w:val="single"/>
+                </w:tcBorders>
+              </w:tcPr>
+              <w:p>
+                <w:pPr>
+                  <w:jc w:val="both"/>
+                  <w:rPr>
+                    <w:i w:val="1"/>
+                    <w:sz w:val="18"/>
+                    <w:szCs w:val="18"/>
+                  </w:rPr>
+                </w:pPr>
+                <w:r>
+                  <w:rPr>
+                    <w:i w:val="1"/>
+                    <w:sz w:val="18"/>
+                    <w:szCs w:val="18"/>
+                    <w:rtl w:val="0"/>
+                  </w:rPr>
+                  <w:t xml:space="preserve">3 días hábiles</w:t>
+                </w:r>
+              </w:p>
+            </w:tc>
+            <w:tc>
+              <w:tcPr>
+                <w:tcBorders>
+                  <w:top w:color="bfbfbf" w:space="0" w:sz="4" w:val="single"/>
+                  <w:left w:color="bfbfbf" w:space="0" w:sz="4" w:val="single"/>
+                  <w:bottom w:color="bfbfbf" w:space="0" w:sz="4" w:val="single"/>
+                  <w:right w:color="bfbfbf" w:space="0" w:sz="4" w:val="single"/>
+                </w:tcBorders>
+              </w:tcPr>
+              <w:p>
+                <w:pPr>
+                  <w:jc w:val="both"/>
+                  <w:rPr>
+                    <w:i w:val="1"/>
+                    <w:sz w:val="18"/>
+                    <w:szCs w:val="18"/>
+                  </w:rPr>
+                </w:pPr>
+                <w:r>
+                  <w:rPr>
+                    <w:i w:val="1"/>
+                    <w:sz w:val="18"/>
+                    <w:szCs w:val="18"/>
+                    <w:rtl w:val="0"/>
+                  </w:rPr>
+                  <w:t xml:space="preserve">Matías González</w:t>
+                </w:r>
+              </w:p>
+            </w:tc>
+            <w:tc>
+              <w:tcPr>
+                <w:tcBorders>
+                  <w:top w:color="bfbfbf" w:space="0" w:sz="4" w:val="single"/>
+                  <w:left w:color="bfbfbf" w:space="0" w:sz="4" w:val="single"/>
+                  <w:bottom w:color="bfbfbf" w:space="0" w:sz="4" w:val="single"/>
+                  <w:right w:color="bfbfbf" w:space="0" w:sz="4" w:val="single"/>
+                </w:tcBorders>
+              </w:tcPr>
+              <w:p>
+                <w:pPr>
+                  <w:jc w:val="both"/>
+                  <w:rPr>
+                    <w:i w:val="1"/>
+                    <w:sz w:val="18"/>
+                    <w:szCs w:val="18"/>
+                  </w:rPr>
+                </w:pPr>
+                <w:r>
+                  <w:rPr>
+                    <w:i w:val="1"/>
+                    <w:sz w:val="18"/>
+                    <w:szCs w:val="18"/>
+                    <w:rtl w:val="0"/>
+                  </w:rPr>
+                  <w:t xml:space="preserve">Se efectuaron pruebas unitarias sobre la funcionalidad de creación, garantizando el cumplimiento de los criterios de aceptación definidos.</w:t>
+                </w:r>
+              </w:p>
+            </w:tc>
+            <w:tc>
+              <w:tcPr>
+                <w:tcBorders>
+                  <w:top w:color="bfbfbf" w:space="0" w:sz="4" w:val="single"/>
+                  <w:left w:color="bfbfbf" w:space="0" w:sz="4" w:val="single"/>
+                  <w:bottom w:color="bfbfbf" w:space="0" w:sz="4" w:val="single"/>
+                  <w:right w:color="bfbfbf" w:space="0" w:sz="4" w:val="single"/>
+                </w:tcBorders>
+              </w:tcPr>
+              <w:p>
+                <w:pPr>
+                  <w:jc w:val="both"/>
+                  <w:rPr>
+                    <w:i w:val="1"/>
+                    <w:sz w:val="18"/>
+                    <w:szCs w:val="18"/>
+                  </w:rPr>
+                </w:pPr>
+                <w:r>
+                  <w:rPr>
+                    <w:i w:val="1"/>
+                    <w:sz w:val="18"/>
+                    <w:szCs w:val="18"/>
+                    <w:rtl w:val="0"/>
+                  </w:rPr>
+                  <w:t xml:space="preserve">Completado</w:t>
+                </w:r>
+              </w:p>
+            </w:tc>
+            <w:tc>
+              <w:tcPr>
+                <w:tcBorders>
+                  <w:top w:color="bfbfbf" w:space="0" w:sz="4" w:val="single"/>
+                  <w:left w:color="bfbfbf" w:space="0" w:sz="4" w:val="single"/>
+                  <w:bottom w:color="bfbfbf" w:space="0" w:sz="4" w:val="single"/>
+                  <w:right w:color="bfbfbf" w:space="0" w:sz="4" w:val="single"/>
+                </w:tcBorders>
+              </w:tcPr>
+              <w:p>
+                <w:pPr>
+                  <w:jc w:val="both"/>
+                  <w:rPr>
+                    <w:i w:val="1"/>
+                    <w:sz w:val="18"/>
+                    <w:szCs w:val="18"/>
+                  </w:rPr>
+                </w:pPr>
+                <w:r>
+                  <w:rPr>
+                    <w:i w:val="1"/>
+                    <w:sz w:val="18"/>
+                    <w:szCs w:val="18"/>
+                    <w:rtl w:val="0"/>
+                  </w:rPr>
+                  <w:t xml:space="preserve">Se ampliaron los casos de prueba y se incorporaron validaciones adicionales para asegurar la cobertura completa del flujo de creación.</w:t>
+                </w:r>
+              </w:p>
+            </w:tc>
+          </w:tr>
+          <w:tr>
+            <w:trPr>
+              <w:cantSplit w:val="0"/>
+              <w:trHeight w:val="440" w:hRule="atLeast"/>
+              <w:tblHeader w:val="0"/>
+            </w:trPr>
+            <w:tc>
+              <w:tcPr>
+                <w:tcBorders>
+                  <w:top w:color="bfbfbf" w:space="0" w:sz="4" w:val="single"/>
+                  <w:left w:color="bfbfbf" w:space="0" w:sz="4" w:val="single"/>
+                  <w:bottom w:color="bfbfbf" w:space="0" w:sz="4" w:val="single"/>
+                  <w:right w:color="bfbfbf" w:space="0" w:sz="4" w:val="single"/>
+                </w:tcBorders>
+              </w:tcPr>
+              <w:p>
+                <w:pPr>
+                  <w:jc w:val="both"/>
+                  <w:rPr>
+                    <w:b w:val="1"/>
+                    <w:sz w:val="18"/>
+                    <w:szCs w:val="18"/>
+                  </w:rPr>
+                </w:pPr>
+                <w:r>
+                  <w:rPr>
+                    <w:b w:val="1"/>
+                    <w:sz w:val="18"/>
+                    <w:szCs w:val="18"/>
+                    <w:rtl w:val="0"/>
+                  </w:rPr>
+                  <w:t xml:space="preserve">Implementar soluciones sistémicas integrales para automatizar u optimizar procesos de negocio de acuerdo a las necesidades de la organización.</w:t>
+                </w:r>
+              </w:p>
+            </w:tc>
+            <w:tc>
+              <w:tcPr>
+                <w:tcBorders>
+                  <w:top w:color="bfbfbf" w:space="0" w:sz="4" w:val="single"/>
+                  <w:left w:color="bfbfbf" w:space="0" w:sz="4" w:val="single"/>
+                  <w:bottom w:color="bfbfbf" w:space="0" w:sz="4" w:val="single"/>
+                  <w:right w:color="bfbfbf" w:space="0" w:sz="4" w:val="single"/>
+                </w:tcBorders>
+              </w:tcPr>
+              <w:p>
+                <w:pPr>
+                  <w:jc w:val="both"/>
+                  <w:rPr>
+                    <w:i w:val="1"/>
+                    <w:sz w:val="18"/>
+                    <w:szCs w:val="18"/>
+                  </w:rPr>
+                </w:pPr>
+                <w:r>
+                  <w:rPr>
+                    <w:i w:val="1"/>
+                    <w:sz w:val="18"/>
+                    <w:szCs w:val="18"/>
+                    <w:rtl w:val="0"/>
+                  </w:rPr>
+                  <w:t xml:space="preserve">Implementar OCR para extracción de datos</w:t>
+                </w:r>
+              </w:p>
+            </w:tc>
+            <w:tc>
+              <w:tcPr>
+                <w:tcBorders>
+                  <w:top w:color="bfbfbf" w:space="0" w:sz="4" w:val="single"/>
+                  <w:left w:color="bfbfbf" w:space="0" w:sz="4" w:val="single"/>
+                  <w:bottom w:color="bfbfbf" w:space="0" w:sz="4" w:val="single"/>
+                  <w:right w:color="bfbfbf" w:space="0" w:sz="4" w:val="single"/>
+                </w:tcBorders>
+              </w:tcPr>
+              <w:p>
+                <w:pPr>
+                  <w:jc w:val="both"/>
+                  <w:rPr>
+                    <w:i w:val="1"/>
+                    <w:sz w:val="18"/>
+                    <w:szCs w:val="18"/>
+                  </w:rPr>
+                </w:pPr>
+                <w:r>
+                  <w:rPr>
+                    <w:i w:val="1"/>
+                    <w:sz w:val="18"/>
+                    <w:szCs w:val="18"/>
+                    <w:rtl w:val="0"/>
+                  </w:rPr>
+                  <w:t xml:space="preserve">Supabase Storage.</w:t>
+                </w:r>
+              </w:p>
+              <w:p>
+                <w:pPr>
+                  <w:jc w:val="both"/>
+                  <w:rPr>
+                    <w:i w:val="1"/>
+                    <w:sz w:val="18"/>
+                    <w:szCs w:val="18"/>
+                  </w:rPr>
+                </w:pPr>
+                <w:r>
+                  <w:rPr>
+                    <w:i w:val="1"/>
+                    <w:sz w:val="18"/>
+                    <w:szCs w:val="18"/>
+                    <w:rtl w:val="0"/>
+                  </w:rPr>
+                  <w:t xml:space="preserve">Supabase Edge Functions</w:t>
+                </w:r>
+              </w:p>
+              <w:p>
+                <w:pPr>
+                  <w:jc w:val="both"/>
+                  <w:rPr>
+                    <w:i w:val="1"/>
+                    <w:sz w:val="18"/>
+                    <w:szCs w:val="18"/>
+                  </w:rPr>
+                </w:pPr>
+                <w:r>
+                  <w:rPr>
+                    <w:i w:val="1"/>
+                    <w:sz w:val="18"/>
+                    <w:szCs w:val="18"/>
+                    <w:rtl w:val="0"/>
+                  </w:rPr>
+                  <w:t xml:space="preserve">Google Gemini AI API</w:t>
+                </w:r>
+              </w:p>
+            </w:tc>
+            <w:tc>
+              <w:tcPr>
+                <w:tcBorders>
+                  <w:top w:color="bfbfbf" w:space="0" w:sz="4" w:val="single"/>
+                  <w:left w:color="bfbfbf" w:space="0" w:sz="4" w:val="single"/>
+                  <w:bottom w:color="bfbfbf" w:space="0" w:sz="4" w:val="single"/>
+                  <w:right w:color="bfbfbf" w:space="0" w:sz="4" w:val="single"/>
+                </w:tcBorders>
+              </w:tcPr>
+              <w:p>
+                <w:pPr>
+                  <w:jc w:val="both"/>
+                  <w:rPr>
+                    <w:i w:val="1"/>
+                    <w:sz w:val="18"/>
+                    <w:szCs w:val="18"/>
+                  </w:rPr>
+                </w:pPr>
+                <w:r>
+                  <w:rPr>
+                    <w:i w:val="1"/>
+                    <w:sz w:val="18"/>
+                    <w:szCs w:val="18"/>
+                    <w:rtl w:val="0"/>
+                  </w:rPr>
+                  <w:t xml:space="preserve">6 días hábiles</w:t>
+                </w:r>
+              </w:p>
+            </w:tc>
+            <w:tc>
+              <w:tcPr>
+                <w:tcBorders>
+                  <w:top w:color="bfbfbf" w:space="0" w:sz="4" w:val="single"/>
+                  <w:left w:color="bfbfbf" w:space="0" w:sz="4" w:val="single"/>
+                  <w:bottom w:color="bfbfbf" w:space="0" w:sz="4" w:val="single"/>
+                  <w:right w:color="bfbfbf" w:space="0" w:sz="4" w:val="single"/>
+                </w:tcBorders>
+              </w:tcPr>
+              <w:p>
+                <w:pPr>
+                  <w:jc w:val="both"/>
+                  <w:rPr>
+                    <w:i w:val="1"/>
+                    <w:sz w:val="18"/>
+                    <w:szCs w:val="18"/>
+                  </w:rPr>
+                </w:pPr>
+                <w:r>
+                  <w:rPr>
+                    <w:i w:val="1"/>
+                    <w:sz w:val="18"/>
+                    <w:szCs w:val="18"/>
+                    <w:rtl w:val="0"/>
+                  </w:rPr>
+                  <w:t xml:space="preserve">Brayan Gatica</w:t>
+                </w:r>
+              </w:p>
+            </w:tc>
+            <w:tc>
+              <w:tcPr>
+                <w:tcBorders>
+                  <w:top w:color="bfbfbf" w:space="0" w:sz="4" w:val="single"/>
+                  <w:left w:color="bfbfbf" w:space="0" w:sz="4" w:val="single"/>
+                  <w:bottom w:color="bfbfbf" w:space="0" w:sz="4" w:val="single"/>
+                  <w:right w:color="bfbfbf" w:space="0" w:sz="4" w:val="single"/>
+                </w:tcBorders>
+              </w:tcPr>
+              <w:p>
+                <w:pPr>
+                  <w:jc w:val="both"/>
+                  <w:rPr>
+                    <w:i w:val="1"/>
+                    <w:sz w:val="18"/>
+                    <w:szCs w:val="18"/>
+                  </w:rPr>
+                </w:pPr>
+                <w:r>
+                  <w:rPr>
+                    <w:i w:val="1"/>
+                    <w:sz w:val="18"/>
+                    <w:szCs w:val="18"/>
+                    <w:rtl w:val="0"/>
+                  </w:rPr>
+                  <w:t xml:space="preserve">Una posible dificultad podría ser la calidad variable de las imágenes capturadas, lo que puede afectar el rendimiento del OCR y la precisión en la extracción de datos. Como facilitador, la realización de pruebas iterativas con ajustes en el preprocesamiento de las imágenes permite mejorar gradualmente los resultados y optimizar el modelo para distintos escenarios.</w:t>
+                </w:r>
+              </w:p>
+              <w:p>
+                <w:pPr>
+                  <w:jc w:val="both"/>
+                  <w:rPr>
+                    <w:i w:val="1"/>
+                    <w:sz w:val="18"/>
+                    <w:szCs w:val="18"/>
+                  </w:rPr>
+                </w:pPr>
+                <w:r>
+                  <w:rPr>
+                    <w:rtl w:val="0"/>
+                  </w:rPr>
+                </w:r>
+              </w:p>
+            </w:tc>
+            <w:tc>
+              <w:tcPr>
+                <w:tcBorders>
+                  <w:top w:color="bfbfbf" w:space="0" w:sz="4" w:val="single"/>
+                  <w:left w:color="bfbfbf" w:space="0" w:sz="4" w:val="single"/>
+                  <w:bottom w:color="bfbfbf" w:space="0" w:sz="4" w:val="single"/>
+                  <w:right w:color="bfbfbf" w:space="0" w:sz="4" w:val="single"/>
+                </w:tcBorders>
+              </w:tcPr>
+              <w:p>
+                <w:pPr>
+                  <w:jc w:val="both"/>
+                  <w:rPr>
+                    <w:i w:val="1"/>
+                    <w:sz w:val="18"/>
+                    <w:szCs w:val="18"/>
+                  </w:rPr>
+                </w:pPr>
+                <w:r>
+                  <w:rPr>
+                    <w:i w:val="1"/>
+                    <w:sz w:val="18"/>
+                    <w:szCs w:val="18"/>
+                    <w:rtl w:val="0"/>
+                  </w:rPr>
+                  <w:t xml:space="preserve">Completado</w:t>
+                </w:r>
+              </w:p>
+            </w:tc>
+            <w:tc>
+              <w:tcPr>
+                <w:tcBorders>
+                  <w:top w:color="bfbfbf" w:space="0" w:sz="4" w:val="single"/>
+                  <w:left w:color="bfbfbf" w:space="0" w:sz="4" w:val="single"/>
+                  <w:bottom w:color="bfbfbf" w:space="0" w:sz="4" w:val="single"/>
+                  <w:right w:color="bfbfbf" w:space="0" w:sz="4" w:val="single"/>
+                </w:tcBorders>
+              </w:tcPr>
+              <w:p>
+                <w:pPr>
+                  <w:jc w:val="both"/>
+                  <w:rPr>
+                    <w:i w:val="1"/>
+                    <w:sz w:val="18"/>
+                    <w:szCs w:val="18"/>
+                  </w:rPr>
+                </w:pPr>
+                <w:r>
+                  <w:rPr>
+                    <w:i w:val="1"/>
+                    <w:sz w:val="18"/>
+                    <w:szCs w:val="18"/>
+                    <w:rtl w:val="0"/>
+                  </w:rPr>
+                  <w:t xml:space="preserve">Se mejoró contraste/brillo antes del reconocimiento para mayor precisión.</w:t>
+                </w:r>
+              </w:p>
+            </w:tc>
+          </w:tr>
+          <w:tr>
+            <w:trPr>
+              <w:cantSplit w:val="0"/>
+              <w:trHeight w:val="440" w:hRule="atLeast"/>
+              <w:tblHeader w:val="0"/>
+            </w:trPr>
+            <w:tc>
+              <w:tcPr>
+                <w:tcBorders>
+                  <w:top w:color="bfbfbf" w:space="0" w:sz="4" w:val="single"/>
+                  <w:left w:color="bfbfbf" w:space="0" w:sz="4" w:val="single"/>
+                  <w:bottom w:color="bfbfbf" w:space="0" w:sz="4" w:val="single"/>
+                  <w:right w:color="bfbfbf" w:space="0" w:sz="4" w:val="single"/>
+                </w:tcBorders>
+              </w:tcPr>
+              <w:p>
+                <w:pPr>
+                  <w:jc w:val="both"/>
+                  <w:rPr>
+                    <w:b w:val="1"/>
+                    <w:sz w:val="18"/>
+                    <w:szCs w:val="18"/>
+                  </w:rPr>
+                </w:pPr>
+                <w:r>
+                  <w:rPr>
+                    <w:b w:val="1"/>
+                    <w:sz w:val="18"/>
+                    <w:szCs w:val="18"/>
+                    <w:rtl w:val="0"/>
+                  </w:rPr>
+                  <w:t xml:space="preserve">Ofrecer propuestas de solución informática analizando de forma integral los procesos de acuerdo a los requerimientos de la organización.</w:t>
+                </w:r>
+              </w:p>
+            </w:tc>
+            <w:tc>
+              <w:tcPr>
+                <w:tcBorders>
+                  <w:top w:color="bfbfbf" w:space="0" w:sz="4" w:val="single"/>
+                  <w:left w:color="bfbfbf" w:space="0" w:sz="4" w:val="single"/>
+                  <w:bottom w:color="bfbfbf" w:space="0" w:sz="4" w:val="single"/>
+                  <w:right w:color="bfbfbf" w:space="0" w:sz="4" w:val="single"/>
+                </w:tcBorders>
+              </w:tcPr>
+              <w:p>
+                <w:pPr>
+                  <w:jc w:val="both"/>
+                  <w:rPr>
+                    <w:i w:val="1"/>
+                    <w:sz w:val="18"/>
+                    <w:szCs w:val="18"/>
+                  </w:rPr>
+                </w:pPr>
+                <w:r>
+                  <w:rPr>
+                    <w:i w:val="1"/>
+                    <w:sz w:val="18"/>
+                    <w:szCs w:val="18"/>
+                    <w:rtl w:val="0"/>
+                  </w:rPr>
+                  <w:t xml:space="preserve">Permitir edición manual de datos extraídos</w:t>
+                </w:r>
+              </w:p>
+            </w:tc>
+            <w:tc>
+              <w:tcPr>
+                <w:tcBorders>
+                  <w:top w:color="bfbfbf" w:space="0" w:sz="4" w:val="single"/>
+                  <w:left w:color="bfbfbf" w:space="0" w:sz="4" w:val="single"/>
+                  <w:bottom w:color="bfbfbf" w:space="0" w:sz="4" w:val="single"/>
+                  <w:right w:color="bfbfbf" w:space="0" w:sz="4" w:val="single"/>
+                </w:tcBorders>
+              </w:tcPr>
+              <w:p>
+                <w:pPr>
+                  <w:jc w:val="both"/>
+                  <w:rPr>
+                    <w:i w:val="1"/>
+                    <w:sz w:val="18"/>
+                    <w:szCs w:val="18"/>
+                  </w:rPr>
+                </w:pPr>
+                <w:r>
+                  <w:rPr>
+                    <w:i w:val="1"/>
+                    <w:sz w:val="18"/>
+                    <w:szCs w:val="18"/>
+                    <w:rtl w:val="0"/>
+                  </w:rPr>
+                  <w:t xml:space="preserve">React, API Backend, Supabase, Figma.</w:t>
+                </w:r>
+              </w:p>
+            </w:tc>
+            <w:tc>
+              <w:tcPr>
+                <w:tcBorders>
+                  <w:top w:color="bfbfbf" w:space="0" w:sz="4" w:val="single"/>
+                  <w:left w:color="bfbfbf" w:space="0" w:sz="4" w:val="single"/>
+                  <w:bottom w:color="bfbfbf" w:space="0" w:sz="4" w:val="single"/>
+                  <w:right w:color="bfbfbf" w:space="0" w:sz="4" w:val="single"/>
+                </w:tcBorders>
+              </w:tcPr>
+              <w:p>
+                <w:pPr>
+                  <w:jc w:val="both"/>
+                  <w:rPr>
+                    <w:i w:val="1"/>
+                    <w:sz w:val="18"/>
+                    <w:szCs w:val="18"/>
+                  </w:rPr>
+                </w:pPr>
+                <w:r>
+                  <w:rPr>
+                    <w:i w:val="1"/>
+                    <w:sz w:val="18"/>
+                    <w:szCs w:val="18"/>
+                    <w:rtl w:val="0"/>
+                  </w:rPr>
+                  <w:t xml:space="preserve">5 días hábiles</w:t>
+                </w:r>
+              </w:p>
+            </w:tc>
+            <w:tc>
+              <w:tcPr>
+                <w:tcBorders>
+                  <w:top w:color="bfbfbf" w:space="0" w:sz="4" w:val="single"/>
+                  <w:left w:color="bfbfbf" w:space="0" w:sz="4" w:val="single"/>
+                  <w:bottom w:color="bfbfbf" w:space="0" w:sz="4" w:val="single"/>
+                  <w:right w:color="bfbfbf" w:space="0" w:sz="4" w:val="single"/>
+                </w:tcBorders>
+              </w:tcPr>
+              <w:p>
+                <w:pPr>
+                  <w:jc w:val="both"/>
+                  <w:rPr>
+                    <w:i w:val="1"/>
+                    <w:sz w:val="18"/>
+                    <w:szCs w:val="18"/>
+                  </w:rPr>
+                </w:pPr>
+                <w:r>
+                  <w:rPr>
+                    <w:i w:val="1"/>
+                    <w:sz w:val="18"/>
+                    <w:szCs w:val="18"/>
+                    <w:rtl w:val="0"/>
+                  </w:rPr>
+                  <w:t xml:space="preserve">Felipe Valdebenito</w:t>
+                </w:r>
+              </w:p>
+            </w:tc>
+            <w:tc>
+              <w:tcPr>
+                <w:tcBorders>
+                  <w:top w:color="bfbfbf" w:space="0" w:sz="4" w:val="single"/>
+                  <w:left w:color="bfbfbf" w:space="0" w:sz="4" w:val="single"/>
+                  <w:bottom w:color="bfbfbf" w:space="0" w:sz="4" w:val="single"/>
+                  <w:right w:color="bfbfbf" w:space="0" w:sz="4" w:val="single"/>
+                </w:tcBorders>
+              </w:tcPr>
+              <w:p>
+                <w:pPr>
+                  <w:jc w:val="both"/>
+                  <w:rPr>
+                    <w:i w:val="1"/>
+                    <w:sz w:val="18"/>
+                    <w:szCs w:val="18"/>
+                  </w:rPr>
+                </w:pPr>
+                <w:r>
+                  <w:rPr>
+                    <w:i w:val="1"/>
+                    <w:sz w:val="18"/>
+                    <w:szCs w:val="18"/>
+                    <w:rtl w:val="0"/>
+                  </w:rPr>
+                  <w:t xml:space="preserve">Una posible dificultad podría ser el diseño de una interfaz que resulte verdaderamente intuitiva para los usuarios. Como facilitador, el feedback constante de los compañeros y la realización de pruebas de usabilidad permiten identificar mejoras y ajustar el diseño para lograr una experiencia más fluida y comprensible.</w:t>
+                </w:r>
+              </w:p>
+              <w:p>
+                <w:pPr>
+                  <w:jc w:val="both"/>
+                  <w:rPr>
+                    <w:i w:val="1"/>
+                    <w:sz w:val="18"/>
+                    <w:szCs w:val="18"/>
+                  </w:rPr>
+                </w:pPr>
+                <w:r>
+                  <w:rPr>
+                    <w:rtl w:val="0"/>
+                  </w:rPr>
+                </w:r>
+              </w:p>
+            </w:tc>
+            <w:tc>
+              <w:tcPr>
+                <w:tcBorders>
+                  <w:top w:color="bfbfbf" w:space="0" w:sz="4" w:val="single"/>
+                  <w:left w:color="bfbfbf" w:space="0" w:sz="4" w:val="single"/>
+                  <w:bottom w:color="bfbfbf" w:space="0" w:sz="4" w:val="single"/>
+                  <w:right w:color="bfbfbf" w:space="0" w:sz="4" w:val="single"/>
+                </w:tcBorders>
+              </w:tcPr>
+              <w:p>
+                <w:pPr>
+                  <w:jc w:val="both"/>
+                  <w:rPr>
+                    <w:i w:val="1"/>
+                    <w:sz w:val="18"/>
+                    <w:szCs w:val="18"/>
+                  </w:rPr>
+                </w:pPr>
+                <w:r>
+                  <w:rPr>
+                    <w:i w:val="1"/>
+                    <w:sz w:val="18"/>
+                    <w:szCs w:val="18"/>
+                    <w:rtl w:val="0"/>
+                  </w:rPr>
+                  <w:t xml:space="preserve">En Curso</w:t>
+                </w:r>
+              </w:p>
+            </w:tc>
+            <w:tc>
+              <w:tcPr>
+                <w:tcBorders>
+                  <w:top w:color="bfbfbf" w:space="0" w:sz="4" w:val="single"/>
+                  <w:left w:color="bfbfbf" w:space="0" w:sz="4" w:val="single"/>
+                  <w:bottom w:color="bfbfbf" w:space="0" w:sz="4" w:val="single"/>
+                  <w:right w:color="bfbfbf" w:space="0" w:sz="4" w:val="single"/>
+                </w:tcBorders>
+              </w:tcPr>
+              <w:p>
+                <w:pPr>
+                  <w:jc w:val="both"/>
+                  <w:rPr>
+                    <w:i w:val="1"/>
+                    <w:sz w:val="18"/>
+                    <w:szCs w:val="18"/>
+                  </w:rPr>
+                </w:pPr>
+                <w:r>
+                  <w:rPr>
+                    <w:i w:val="1"/>
+                    <w:sz w:val="18"/>
+                    <w:szCs w:val="18"/>
+                    <w:rtl w:val="0"/>
+                  </w:rPr>
+                  <w:t xml:space="preserve">Se añadieron validaciones automáticas y campos resaltados en edición.</w:t>
+                </w:r>
+              </w:p>
+            </w:tc>
+          </w:tr>
+        </w:tbl>
+      </w:sdtContent>
+    </w:sdt>
+    <w:p>
+      <w:pPr>
+        <w:rPr>
+          <w:color w:val="595959"/>
+          <w:sz w:val="24"/>
+          <w:szCs w:val="24"/>
+        </w:rPr>
+      </w:pPr>
+      <w:r>
+        <w:rPr>
+          <w:rtl w:val="0"/>
+        </w:rPr>
+      </w:r>
+    </w:p>
+    <w:p>
+      <w:pPr>
+        <w:rPr>
+          <w:color w:val="595959"/>
+          <w:sz w:val="24"/>
+          <w:szCs w:val="24"/>
+        </w:rPr>
+      </w:pPr>
+      <w:r>
+        <w:rPr>
+          <w:rtl w:val="0"/>
+        </w:rPr>
+      </w:r>
+    </w:p>
+    <w:p>
+      <w:pPr>
+        <w:rPr>
+          <w:color w:val="595959"/>
+          <w:sz w:val="24"/>
+          <w:szCs w:val="24"/>
+        </w:rPr>
+      </w:pPr>
+      <w:r>
+        <w:rPr>
+          <w:rtl w:val="0"/>
+        </w:rPr>
+      </w:r>
+    </w:p>
+    <w:p>
+      <w:pPr>
+        <w:rPr>
+          <w:color w:val="595959"/>
+          <w:sz w:val="24"/>
+          <w:szCs w:val="24"/>
+        </w:rPr>
+      </w:pPr>
+      <w:r>
+        <w:rPr>
+          <w:rtl w:val="0"/>
+        </w:rPr>
+      </w:r>
+    </w:p>
+    <w:p>
+      <w:pPr>
+        <w:rPr>
+          <w:color w:val="595959"/>
+          <w:sz w:val="24"/>
+          <w:szCs w:val="24"/>
+        </w:rPr>
+      </w:pPr>
+      <w:r>
+        <w:rPr>
+          <w:rtl w:val="0"/>
+        </w:rPr>
+      </w:r>
+    </w:p>
+    <w:p>
+      <w:pPr>
+        <w:rPr>
+          <w:color w:val="595959"/>
+          <w:sz w:val="24"/>
+          <w:szCs w:val="24"/>
+        </w:rPr>
+      </w:pPr>
+      <w:r>
+        <w:rPr>
+          <w:rtl w:val="0"/>
+        </w:rPr>
+      </w:r>
+    </w:p>
+    <w:p>
+      <w:pPr>
+        <w:rPr>
+          <w:color w:val="595959"/>
+          <w:sz w:val="24"/>
+          <w:szCs w:val="24"/>
+        </w:rPr>
+      </w:pPr>
+      <w:r>
+        <w:rPr>
+          <w:rtl w:val="0"/>
+        </w:rPr>
+      </w:r>
+    </w:p>
+    <w:p>
+      <w:pPr>
+        <w:rPr>
+          <w:color w:val="595959"/>
+          <w:sz w:val="24"/>
+          <w:szCs w:val="24"/>
+        </w:rPr>
+      </w:pPr>
+      <w:r>
+        <w:rPr>
+          <w:rtl w:val="0"/>
+        </w:rPr>
+      </w:r>
+    </w:p>
+    <w:sdt>
+      <w:sdtPr>
+        <w:lock w:val="contentLocked"/>
+        <w:id w:val="782136629"/>
+        <w:tag w:val="goog_rdk_2"/>
+      </w:sdtPr>
+      <w:sdtContent>
+        <w:tbl>
+          <w:tblPr>
+            <w:tblStyle w:val="Table5"/>
             <w:tblW w:w="9498.0" w:type="dxa"/>
             <w:jc w:val="left"/>
             <w:tblInd w:w="-572.0" w:type="dxa"/>
@@ -1020,7 +3981,6 @@
           <w:tr>
             <w:trPr>
               <w:cantSplit w:val="0"/>
-              <w:trHeight w:val="440" w:hRule="atLeast"/>
               <w:tblHeader w:val="0"/>
             </w:trPr>
             <w:tc>
@@ -1101,7 +4061,7 @@
     </w:p>
     <w:tbl>
       <w:tblPr>
-        <w:tblStyle w:val="Table4"/>
+        <w:tblStyle w:val="Table6"/>
         <w:tblpPr w:leftFromText="180" w:rightFromText="180" w:topFromText="0" w:bottomFromText="0" w:vertAnchor="text" w:horzAnchor="text" w:tblpX="-572" w:tblpY="1"/>
         <w:tblW w:w="9496.0" w:type="dxa"/>
         <w:jc w:val="left"/>
@@ -1361,7 +4321,7 @@
     </w:p>
     <w:tbl>
       <w:tblPr>
-        <w:tblStyle w:val="Table5"/>
+        <w:tblStyle w:val="Table7"/>
         <w:tblpPr w:leftFromText="180" w:rightFromText="180" w:topFromText="0" w:bottomFromText="0" w:vertAnchor="text" w:horzAnchor="text" w:tblpX="-572" w:tblpY="107"/>
         <w:tblW w:w="9493.0" w:type="dxa"/>
         <w:jc w:val="left"/>
@@ -1577,7 +4537,7 @@
     </w:p>
     <w:tbl>
       <w:tblPr>
-        <w:tblStyle w:val="Table6"/>
+        <w:tblStyle w:val="Table8"/>
         <w:tblW w:w="9498.0" w:type="dxa"/>
         <w:jc w:val="left"/>
         <w:tblInd w:w="-572.0" w:type="dxa"/>
@@ -1692,8 +4652,8 @@
       </w:r>
     </w:p>
     <w:sectPr>
-      <w:headerReference r:id="rId8" w:type="default"/>
-      <w:footerReference r:id="rId9" w:type="default"/>
+      <w:headerReference r:id="rId9" w:type="default"/>
+      <w:footerReference r:id="rId10" w:type="default"/>
       <w:pgSz w:h="16838" w:w="11906" w:orient="portrait"/>
       <w:pgMar w:bottom="1417" w:top="1417" w:left="1701" w:right="1701" w:header="708" w:footer="708"/>
       <w:pgNumType w:start="1"/>
@@ -1715,6 +4675,35 @@
     </w:r>
   </w:p>
 </w:ftr>
+</file>
+
+<file path=word/footnotes.xml><?xml version="1.0" encoding="utf-8"?>
+<w:footnotes xmlns:mc="http://schemas.openxmlformats.org/markup-compatibility/2006" xmlns:o="urn:schemas-microsoft-com:office:office" xmlns:r="http://schemas.openxmlformats.org/officeDocument/2006/relationships" xmlns:m="http://schemas.openxmlformats.org/officeDocument/2006/math" xmlns:v="urn:schemas-microsoft-com:vml" xmlns:wp="http://schemas.openxmlformats.org/drawingml/2006/wordprocessingDrawing" xmlns:w10="urn:schemas-microsoft-com:office:word" xmlns:w="http://schemas.openxmlformats.org/wordprocessingml/2006/main" xmlns:wne="http://schemas.microsoft.com/office/word/2006/wordml" xmlns:sl="http://schemas.openxmlformats.org/schemaLibrary/2006/main" xmlns:a="http://schemas.openxmlformats.org/drawingml/2006/main" xmlns:pic="http://schemas.openxmlformats.org/drawingml/2006/picture" xmlns:c="http://schemas.openxmlformats.org/drawingml/2006/chart" xmlns:lc="http://schemas.openxmlformats.org/drawingml/2006/lockedCanvas" xmlns:dgm="http://schemas.openxmlformats.org/drawingml/2006/diagram" xmlns:wps="http://schemas.microsoft.com/office/word/2010/wordprocessingShape" xmlns:wpg="http://schemas.microsoft.com/office/word/2010/wordprocessingGroup" xmlns:w14="http://schemas.microsoft.com/office/word/2010/wordml" xmlns:w15="http://schemas.microsoft.com/office/word/2012/wordml" xmlns:w16="http://schemas.microsoft.com/office/word/2018/wordml" xmlns:w16cex="http://schemas.microsoft.com/office/word/2018/wordml/cex" xmlns:w16cid="http://schemas.microsoft.com/office/word/2016/wordml/cid" xmlns="http://schemas.microsoft.com/office/tasks/2019/documenttasks" xmlns:cr="http://schemas.microsoft.com/office/comments/2020/reactions">
+  <w:footnote w:id="0">
+    <w:p>
+      <w:pPr>
+        <w:spacing w:after="0" w:line="240" w:lineRule="auto"/>
+        <w:rPr>
+          <w:color w:val="595959"/>
+          <w:sz w:val="20"/>
+          <w:szCs w:val="20"/>
+        </w:rPr>
+      </w:pPr>
+      <w:r>
+        <w:rPr>
+          <w:rStyle w:val="FootnoteReference"/>
+          <w:vertAlign w:val="superscript"/>
+        </w:rPr>
+        <w:footnoteRef/>
+      </w:r>
+      <w:r>
+        <w:rPr>
+          <w:rtl w:val="0"/>
+        </w:rPr>
+      </w:r>
+    </w:p>
+  </w:footnote>
+</w:footnotes>
 </file>
 
 <file path=word/header1.xml><?xml version="1.0" encoding="utf-8"?>
@@ -1758,7 +4747,7 @@
   </w:p>
   <w:tbl>
     <w:tblPr>
-      <w:tblStyle w:val="Table7"/>
+      <w:tblStyle w:val="Table9"/>
       <w:tblW w:w="10170.0" w:type="dxa"/>
       <w:jc w:val="left"/>
       <w:tblInd w:w="-709.0" w:type="dxa"/>
@@ -2421,36 +5410,16 @@
   </w:style>
   <w:style w:type="table" w:styleId="Table3">
     <w:basedOn w:val="TableNormal"/>
-    <w:rPr>
-      <w:sz w:val="22"/>
-      <w:szCs w:val="22"/>
-    </w:rPr>
     <w:tblPr>
       <w:tblStyleRowBandSize w:val="1"/>
       <w:tblStyleColBandSize w:val="1"/>
-      <w:tblCellMar>
-        <w:top w:w="0.0" w:type="dxa"/>
-        <w:left w:w="108.0" w:type="dxa"/>
-        <w:bottom w:w="0.0" w:type="dxa"/>
-        <w:right w:w="108.0" w:type="dxa"/>
-      </w:tblCellMar>
     </w:tblPr>
   </w:style>
   <w:style w:type="table" w:styleId="Table4">
     <w:basedOn w:val="TableNormal"/>
-    <w:rPr>
-      <w:sz w:val="22"/>
-      <w:szCs w:val="22"/>
-    </w:rPr>
     <w:tblPr>
       <w:tblStyleRowBandSize w:val="1"/>
       <w:tblStyleColBandSize w:val="1"/>
-      <w:tblCellMar>
-        <w:top w:w="0.0" w:type="dxa"/>
-        <w:left w:w="108.0" w:type="dxa"/>
-        <w:bottom w:w="0.0" w:type="dxa"/>
-        <w:right w:w="108.0" w:type="dxa"/>
-      </w:tblCellMar>
     </w:tblPr>
   </w:style>
   <w:style w:type="table" w:styleId="Table5">
@@ -2488,6 +5457,40 @@
     </w:tblPr>
   </w:style>
   <w:style w:type="table" w:styleId="Table7">
+    <w:basedOn w:val="TableNormal"/>
+    <w:rPr>
+      <w:sz w:val="22"/>
+      <w:szCs w:val="22"/>
+    </w:rPr>
+    <w:tblPr>
+      <w:tblStyleRowBandSize w:val="1"/>
+      <w:tblStyleColBandSize w:val="1"/>
+      <w:tblCellMar>
+        <w:top w:w="0.0" w:type="dxa"/>
+        <w:left w:w="108.0" w:type="dxa"/>
+        <w:bottom w:w="0.0" w:type="dxa"/>
+        <w:right w:w="108.0" w:type="dxa"/>
+      </w:tblCellMar>
+    </w:tblPr>
+  </w:style>
+  <w:style w:type="table" w:styleId="Table8">
+    <w:basedOn w:val="TableNormal"/>
+    <w:rPr>
+      <w:sz w:val="22"/>
+      <w:szCs w:val="22"/>
+    </w:rPr>
+    <w:tblPr>
+      <w:tblStyleRowBandSize w:val="1"/>
+      <w:tblStyleColBandSize w:val="1"/>
+      <w:tblCellMar>
+        <w:top w:w="0.0" w:type="dxa"/>
+        <w:left w:w="108.0" w:type="dxa"/>
+        <w:bottom w:w="0.0" w:type="dxa"/>
+        <w:right w:w="108.0" w:type="dxa"/>
+      </w:tblCellMar>
+    </w:tblPr>
+  </w:style>
+  <w:style w:type="table" w:styleId="Table9">
     <w:basedOn w:val="TableNormal"/>
     <w:rPr>
       <w:sz w:val="22"/>
@@ -2804,7 +5807,7 @@
 
 <file path=customXML/item1.xml><?xml version="1.0" encoding="utf-8"?>
 <go:gDocsCustomXmlDataStorage xmlns:go="http://customooxmlschemas.google.com/" xmlns:r="http://schemas.openxmlformats.org/officeDocument/2006/relationships" uri="GoogleDocsCustomDataVersion2">
-  <go:docsCustomData xmlns:go="http://customooxmlschemas.google.com/" roundtripDataSignature="AMtx7mgsI/jjt/LOirTs/3CA7+CJGJPW0Q==">CgMxLjAaHwoBMBIaChgICVIUChJ0YWJsZS55eDh2ajFteXhxcDEyDmgueDQ3bzUyNmc1ZWNsOAByITE1dGFRQkd4UFhMUExkOG5taXJYYmEzMUpGaGxjc2kzRQ==</go:docsCustomData>
+  <go:docsCustomData xmlns:go="http://customooxmlschemas.google.com/" roundtripDataSignature="AMtx7mh967gOBhlLxZlXl0DIKHvlKZwYRw==">CgMxLjAaHwoBMBIaChgICVIUChJ0YWJsZS5meXZxY3NpYzNhZmoaHwoBMRIaChgICVIUChJ0YWJsZS42MHFvbGxzaWJ3a3oaHwoBMhIaChgICVIUChJ0YWJsZS55eDh2ajFteXhxcDEyDmgueDQ3bzUyNmc1ZWNsOAByITE1dGFRQkd4UFhMUExkOG5taXJYYmEzMUpGaGxjc2kzRQ==</go:docsCustomData>
 </go:gDocsCustomXmlDataStorage>
 </file>
 

</xml_diff>